<commit_message>
adding missing sections in pdf
</commit_message>
<xml_diff>
--- a/Group112 (1).docx
+++ b/Group112 (1).docx
@@ -1,6 +1,6 @@
 
 <file path=word/document.xml><?xml version="1.0" encoding="utf-8"?>
-<w:document xmlns:wpc="http://schemas.microsoft.com/office/word/2010/wordprocessingCanvas" xmlns:cx="http://schemas.microsoft.com/office/drawing/2014/chartex" xmlns:cx1="http://schemas.microsoft.com/office/drawing/2015/9/8/chartex" xmlns:cx2="http://schemas.microsoft.com/office/drawing/2015/10/21/chartex" xmlns:cx3="http://schemas.microsoft.com/office/drawing/2016/5/9/chartex" xmlns:cx4="http://schemas.microsoft.com/office/drawing/2016/5/10/chartex" xmlns:cx5="http://schemas.microsoft.com/office/drawing/2016/5/11/chartex" xmlns:cx6="http://schemas.microsoft.com/office/drawing/2016/5/12/chartex" xmlns:cx7="http://schemas.microsoft.com/office/drawing/2016/5/13/chartex" xmlns:cx8="http://schemas.microsoft.com/office/drawing/2016/5/14/chartex" xmlns:mc="http://schemas.openxmlformats.org/markup-compatibility/2006" xmlns:aink="http://schemas.microsoft.com/office/drawing/2016/ink" xmlns:am3d="http://schemas.microsoft.com/office/drawing/2017/model3d" xmlns:o="urn:schemas-microsoft-com:office:office" xmlns:oel="http://schemas.microsoft.com/office/2019/extlst" xmlns:r="http://schemas.openxmlformats.org/officeDocument/2006/relationships" xmlns:m="http://schemas.openxmlformats.org/officeDocument/2006/math" xmlns:v="urn:schemas-microsoft-com:vml" xmlns:wp14="http://schemas.microsoft.com/office/word/2010/wordprocessingDrawing" xmlns:wp="http://schemas.openxmlformats.org/drawingml/2006/wordprocessingDrawing" xmlns:w10="urn:schemas-microsoft-com:office:word" xmlns:w="http://schemas.openxmlformats.org/wordprocessingml/2006/main" xmlns:w14="http://schemas.microsoft.com/office/word/2010/wordml" xmlns:w15="http://schemas.microsoft.com/office/word/2012/wordml" xmlns:w16cei="http://schemas.microsoft.com/office/word/2026/wordml/cei" xmlns:w16cex="http://schemas.microsoft.com/office/word/2018/wordml/cex" xmlns:w16cid="http://schemas.microsoft.com/office/word/2016/wordml/cid" xmlns:w16="http://schemas.microsoft.com/office/word/2018/wordml" xmlns:w16du="http://schemas.microsoft.com/office/word/2023/wordml/word16du" xmlns:w16sdtdh="http://schemas.microsoft.com/office/word/2020/wordml/sdtdatahash" xmlns:w16sdtfl="http://schemas.microsoft.com/office/word/2024/wordml/sdtformatlock" xmlns:w16se="http://schemas.microsoft.com/office/word/2015/wordml/symex" xmlns:wpg="http://schemas.microsoft.com/office/word/2010/wordprocessingGroup" xmlns:wpi="http://schemas.microsoft.com/office/word/2010/wordprocessingInk" xmlns:wne="http://schemas.microsoft.com/office/word/2006/wordml" xmlns:wps="http://schemas.microsoft.com/office/word/2010/wordprocessingShape" mc:Ignorable="w14 w15 w16se w16cid w16 w16cex w16sdtdh w16sdtfl w16du wp14">
+<w:document xmlns:wpc="http://schemas.microsoft.com/office/word/2010/wordprocessingCanvas" xmlns:cx="http://schemas.microsoft.com/office/drawing/2014/chartex" xmlns:cx1="http://schemas.microsoft.com/office/drawing/2015/9/8/chartex" xmlns:cx2="http://schemas.microsoft.com/office/drawing/2015/10/21/chartex" xmlns:cx3="http://schemas.microsoft.com/office/drawing/2016/5/9/chartex" xmlns:cx4="http://schemas.microsoft.com/office/drawing/2016/5/10/chartex" xmlns:cx5="http://schemas.microsoft.com/office/drawing/2016/5/11/chartex" xmlns:cx6="http://schemas.microsoft.com/office/drawing/2016/5/12/chartex" xmlns:cx7="http://schemas.microsoft.com/office/drawing/2016/5/13/chartex" xmlns:cx8="http://schemas.microsoft.com/office/drawing/2016/5/14/chartex" xmlns:mc="http://schemas.openxmlformats.org/markup-compatibility/2006" xmlns:aink="http://schemas.microsoft.com/office/drawing/2016/ink" xmlns:am3d="http://schemas.microsoft.com/office/drawing/2017/model3d" xmlns:o="urn:schemas-microsoft-com:office:office" xmlns:oel="http://schemas.microsoft.com/office/2019/extlst" xmlns:r="http://schemas.openxmlformats.org/officeDocument/2006/relationships" xmlns:m="http://schemas.openxmlformats.org/officeDocument/2006/math" xmlns:v="urn:schemas-microsoft-com:vml" xmlns:wp14="http://schemas.microsoft.com/office/word/2010/wordprocessingDrawing" xmlns:wp="http://schemas.openxmlformats.org/drawingml/2006/wordprocessingDrawing" xmlns:w10="urn:schemas-microsoft-com:office:word" xmlns:w="http://schemas.openxmlformats.org/wordprocessingml/2006/main" xmlns:w14="http://schemas.microsoft.com/office/word/2010/wordml" xmlns:w15="http://schemas.microsoft.com/office/word/2012/wordml" xmlns:w16cex="http://schemas.microsoft.com/office/word/2018/wordml/cex" xmlns:w16cid="http://schemas.microsoft.com/office/word/2016/wordml/cid" xmlns:w16="http://schemas.microsoft.com/office/word/2018/wordml" xmlns:w16du="http://schemas.microsoft.com/office/word/2023/wordml/word16du" xmlns:w16sdtdh="http://schemas.microsoft.com/office/word/2020/wordml/sdtdatahash" xmlns:w16sdtfl="http://schemas.microsoft.com/office/word/2024/wordml/sdtformatlock" xmlns:w16se="http://schemas.microsoft.com/office/word/2015/wordml/symex" xmlns:wpg="http://schemas.microsoft.com/office/word/2010/wordprocessingGroup" xmlns:wpi="http://schemas.microsoft.com/office/word/2010/wordprocessingInk" xmlns:wne="http://schemas.microsoft.com/office/word/2006/wordml" xmlns:wps="http://schemas.microsoft.com/office/word/2010/wordprocessingShape" mc:Ignorable="w14 w15 w16se w16cid w16 w16cex w16sdtdh w16sdtfl w16du wp14">
   <w:body>
     <w:p>
       <w:pPr>
@@ -2122,10 +2122,12 @@
           <w:szCs w:val="21"/>
           <w:lang w:val="en"/>
         </w:rPr>
-        <w:t xml:space="preserve">This project implements an English-to-Hindi neural machine translation system for digital-content localization and educational accessibility. The solution uses a sequence-to-sequence architecture with a bidirectional LSTM encoder, </w:t>
-      </w:r>
-      <w:proofErr w:type="spellStart"/>
-      <w:r>
+        <w:t>This project implements an English-to-Hindi neural machine translation system for digital-content localization and educational accessibility. The solution uses a sequence-to-sequence architecture with a bidirectional LSTM encoder, Bahdanau additive attention and an LSTM decoder. A Streamlit interface supports single-sentence translation, greedy or beam-search decoding, and batch translation from TXT or CSV input.</w:t>
+      </w:r>
+    </w:p>
+    <w:p>
+      <w:pPr>
+        <w:pStyle w:val="NormalWeb"/>
         <w:rPr>
           <w:rFonts w:ascii="Aptos" w:hAnsi="Aptos"/>
           <w:color w:val="1F2933"/>
@@ -2133,10 +2135,11 @@
           <w:szCs w:val="21"/>
           <w:lang w:val="en"/>
         </w:rPr>
-        <w:t>Bahdanau</w:t>
-      </w:r>
-      <w:proofErr w:type="spellEnd"/>
-      <w:r>
+      </w:pPr>
+    </w:p>
+    <w:p>
+      <w:pPr>
+        <w:pStyle w:val="NormalWeb"/>
         <w:rPr>
           <w:rFonts w:ascii="Aptos" w:hAnsi="Aptos"/>
           <w:color w:val="1F2933"/>
@@ -2144,9 +2147,7 @@
           <w:szCs w:val="21"/>
           <w:lang w:val="en"/>
         </w:rPr>
-        <w:t xml:space="preserve"> additive attention and an LSTM decoder. A </w:t>
-      </w:r>
-      <w:proofErr w:type="spellStart"/>
+      </w:pPr>
       <w:r>
         <w:rPr>
           <w:rFonts w:ascii="Aptos" w:hAnsi="Aptos"/>
@@ -2155,9 +2156,8 @@
           <w:szCs w:val="21"/>
           <w:lang w:val="en"/>
         </w:rPr>
-        <w:t>Streamlit</w:t>
-      </w:r>
-      <w:proofErr w:type="spellEnd"/>
+        <w:t xml:space="preserve">The system was trained on a cleaned subset of the AI4Bharat Samanantar English-Hindi parallel corpus. After normalization, length filtering and deduplication, 44,917 sentence pairs were retained and divided into training, validation and test partitions. On a 500-pair evaluation sample, the checkpoint achieved BLEU </w:t>
+      </w:r>
       <w:r>
         <w:rPr>
           <w:rFonts w:ascii="Aptos" w:hAnsi="Aptos"/>
@@ -2166,12 +2166,9 @@
           <w:szCs w:val="21"/>
           <w:lang w:val="en"/>
         </w:rPr>
-        <w:t xml:space="preserve"> interface supports single-sentence translation, greedy or beam-search decoding, and batch translation from TXT or CSV input.</w:t>
-      </w:r>
-    </w:p>
-    <w:p>
-      <w:pPr>
-        <w:pStyle w:val="NormalWeb"/>
+        <w:t>14.60</w:t>
+      </w:r>
+      <w:r>
         <w:rPr>
           <w:rFonts w:ascii="Aptos" w:hAnsi="Aptos"/>
           <w:color w:val="1F2933"/>
@@ -2179,70 +2176,7 @@
           <w:szCs w:val="21"/>
           <w:lang w:val="en"/>
         </w:rPr>
-      </w:pPr>
-    </w:p>
-    <w:p>
-      <w:pPr>
-        <w:pStyle w:val="NormalWeb"/>
-        <w:rPr>
-          <w:rFonts w:ascii="Aptos" w:hAnsi="Aptos"/>
-          <w:color w:val="1F2933"/>
-          <w:sz w:val="21"/>
-          <w:szCs w:val="21"/>
-          <w:lang w:val="en"/>
-        </w:rPr>
-      </w:pPr>
-      <w:r>
-        <w:rPr>
-          <w:rFonts w:ascii="Aptos" w:hAnsi="Aptos"/>
-          <w:color w:val="1F2933"/>
-          <w:sz w:val="21"/>
-          <w:szCs w:val="21"/>
-          <w:lang w:val="en"/>
-        </w:rPr>
-        <w:t xml:space="preserve">The system was trained on a cleaned subset of the AI4Bharat Samanantar English-Hindi parallel corpus. After normalization, length filtering and deduplication, 44,917 sentence pairs were retained and divided into training, validation and test partitions. On a 500-pair evaluation sample, the checkpoint achieved BLEU </w:t>
-      </w:r>
-      <w:r>
-        <w:rPr>
-          <w:rFonts w:ascii="Aptos" w:hAnsi="Aptos"/>
-          <w:color w:val="1F2933"/>
-          <w:sz w:val="21"/>
-          <w:szCs w:val="21"/>
-          <w:lang w:val="en"/>
-        </w:rPr>
-        <w:t>14.60</w:t>
-      </w:r>
-      <w:r>
-        <w:rPr>
-          <w:rFonts w:ascii="Aptos" w:hAnsi="Aptos"/>
-          <w:color w:val="1F2933"/>
-          <w:sz w:val="21"/>
-          <w:szCs w:val="21"/>
-          <w:lang w:val="en"/>
-        </w:rPr>
-        <w:t xml:space="preserve">, </w:t>
-      </w:r>
-      <w:proofErr w:type="spellStart"/>
-      <w:r>
-        <w:rPr>
-          <w:rFonts w:ascii="Aptos" w:hAnsi="Aptos"/>
-          <w:color w:val="1F2933"/>
-          <w:sz w:val="21"/>
-          <w:szCs w:val="21"/>
-          <w:lang w:val="en"/>
-        </w:rPr>
-        <w:t>chrF</w:t>
-      </w:r>
-      <w:proofErr w:type="spellEnd"/>
-      <w:r>
-        <w:rPr>
-          <w:rFonts w:ascii="Aptos" w:hAnsi="Aptos"/>
-          <w:color w:val="1F2933"/>
-          <w:sz w:val="21"/>
-          <w:szCs w:val="21"/>
-          <w:lang w:val="en"/>
-        </w:rPr>
-        <w:t xml:space="preserve"> 2</w:t>
+        <w:t>, chrF 2</w:t>
       </w:r>
       <w:r>
         <w:rPr>
@@ -3138,6 +3072,258 @@
     </w:p>
     <w:p>
       <w:pPr>
+        <w:pStyle w:val="NormalWeb"/>
+        <w:rPr>
+          <w:rFonts w:ascii="Aptos" w:hAnsi="Aptos"/>
+          <w:color w:val="1F2933"/>
+          <w:sz w:val="21"/>
+          <w:szCs w:val="21"/>
+          <w:lang w:val="en"/>
+        </w:rPr>
+      </w:pPr>
+    </w:p>
+    <w:p>
+      <w:pPr>
+        <w:pStyle w:val="NormalWeb"/>
+        <w:rPr>
+          <w:rFonts w:asciiTheme="minorHAnsi" w:hAnsiTheme="minorHAnsi" w:cstheme="minorHAnsi"/>
+          <w:color w:val="1F2933"/>
+          <w:sz w:val="21"/>
+          <w:szCs w:val="21"/>
+        </w:rPr>
+      </w:pPr>
+      <w:r>
+        <w:rPr>
+          <w:rStyle w:val="Heading3Char"/>
+          <w:rFonts w:asciiTheme="minorHAnsi" w:hAnsiTheme="minorHAnsi" w:cstheme="minorHAnsi"/>
+        </w:rPr>
+        <w:t>Application domain</w:t>
+      </w:r>
+    </w:p>
+    <w:p>
+      <w:pPr>
+        <w:pStyle w:val="NormalWeb"/>
+        <w:rPr>
+          <w:rFonts w:asciiTheme="minorHAnsi" w:hAnsiTheme="minorHAnsi" w:cstheme="minorHAnsi"/>
+          <w:color w:val="1F2933"/>
+          <w:sz w:val="21"/>
+          <w:szCs w:val="21"/>
+        </w:rPr>
+      </w:pPr>
+      <w:r>
+        <w:rPr>
+          <w:rFonts w:asciiTheme="minorHAnsi" w:hAnsiTheme="minorHAnsi" w:cstheme="minorHAnsi"/>
+          <w:color w:val="1F2933"/>
+          <w:sz w:val="21"/>
+          <w:szCs w:val="21"/>
+        </w:rPr>
+        <w:t>Digital content localization and educational accessibility, covering documentation, government notices, and learning material originally authored in English.</w:t>
+      </w:r>
+    </w:p>
+    <w:p>
+      <w:pPr>
+        <w:pStyle w:val="NormalWeb"/>
+        <w:rPr>
+          <w:rFonts w:asciiTheme="minorHAnsi" w:hAnsiTheme="minorHAnsi" w:cstheme="minorHAnsi"/>
+          <w:color w:val="1F2933"/>
+          <w:sz w:val="21"/>
+          <w:szCs w:val="21"/>
+        </w:rPr>
+      </w:pPr>
+      <w:r>
+        <w:rPr>
+          <w:rStyle w:val="Heading3Char"/>
+          <w:rFonts w:asciiTheme="minorHAnsi" w:hAnsiTheme="minorHAnsi" w:cstheme="minorHAnsi"/>
+        </w:rPr>
+        <w:t>Target user group</w:t>
+      </w:r>
+    </w:p>
+    <w:p>
+      <w:pPr>
+        <w:pStyle w:val="NormalWeb"/>
+        <w:rPr>
+          <w:rFonts w:asciiTheme="minorHAnsi" w:hAnsiTheme="minorHAnsi" w:cstheme="minorHAnsi"/>
+          <w:color w:val="1F2933"/>
+          <w:sz w:val="21"/>
+          <w:szCs w:val="21"/>
+        </w:rPr>
+      </w:pPr>
+      <w:r>
+        <w:rPr>
+          <w:rFonts w:asciiTheme="minorHAnsi" w:hAnsiTheme="minorHAnsi" w:cstheme="minorHAnsi"/>
+          <w:color w:val="1F2933"/>
+          <w:sz w:val="21"/>
+          <w:szCs w:val="21"/>
+        </w:rPr>
+        <w:t>Hindi-speaking users who are more comfortable reading Hindi than English and who need access to English-authored digital content, official notices, and learning material.</w:t>
+      </w:r>
+    </w:p>
+    <w:p>
+      <w:pPr>
+        <w:pStyle w:val="NormalWeb"/>
+        <w:rPr>
+          <w:rFonts w:asciiTheme="minorHAnsi" w:hAnsiTheme="minorHAnsi" w:cstheme="minorHAnsi"/>
+          <w:color w:val="1F2933"/>
+          <w:sz w:val="21"/>
+          <w:szCs w:val="21"/>
+        </w:rPr>
+      </w:pPr>
+      <w:r>
+        <w:rPr>
+          <w:rStyle w:val="Heading3Char"/>
+          <w:rFonts w:asciiTheme="minorHAnsi" w:hAnsiTheme="minorHAnsi" w:cstheme="minorHAnsi"/>
+        </w:rPr>
+        <w:t>Problem statement</w:t>
+      </w:r>
+    </w:p>
+    <w:p>
+      <w:pPr>
+        <w:pStyle w:val="NormalWeb"/>
+        <w:rPr>
+          <w:rFonts w:asciiTheme="minorHAnsi" w:hAnsiTheme="minorHAnsi" w:cstheme="minorHAnsi"/>
+          <w:color w:val="1F2933"/>
+          <w:sz w:val="21"/>
+          <w:szCs w:val="21"/>
+        </w:rPr>
+      </w:pPr>
+      <w:r>
+        <w:rPr>
+          <w:rFonts w:asciiTheme="minorHAnsi" w:hAnsiTheme="minorHAnsi" w:cstheme="minorHAnsi"/>
+          <w:color w:val="1F2933"/>
+          <w:sz w:val="21"/>
+          <w:szCs w:val="21"/>
+        </w:rPr>
+        <w:t>English-authored content is not accessible to a large section of users who prefer regional languages, and manual translation is slow, costly, and inconsistent in terminology. This project builds an automated translation system that converts English text into Hindi so that such content becomes usable for Hindi-preferring readers.</w:t>
+      </w:r>
+    </w:p>
+    <w:p>
+      <w:pPr>
+        <w:pStyle w:val="NormalWeb"/>
+        <w:rPr>
+          <w:rFonts w:asciiTheme="minorHAnsi" w:hAnsiTheme="minorHAnsi" w:cstheme="minorHAnsi"/>
+          <w:color w:val="1F2933"/>
+          <w:sz w:val="21"/>
+          <w:szCs w:val="21"/>
+        </w:rPr>
+      </w:pPr>
+      <w:r>
+        <w:rPr>
+          <w:rStyle w:val="Heading3Char"/>
+          <w:rFonts w:asciiTheme="minorHAnsi" w:hAnsiTheme="minorHAnsi" w:cstheme="minorHAnsi"/>
+        </w:rPr>
+        <w:t>Functional requirements</w:t>
+      </w:r>
+    </w:p>
+    <w:p>
+      <w:pPr>
+        <w:pStyle w:val="NormalWeb"/>
+        <w:rPr>
+          <w:rFonts w:asciiTheme="minorHAnsi" w:hAnsiTheme="minorHAnsi" w:cstheme="minorHAnsi"/>
+          <w:color w:val="1F2933"/>
+          <w:sz w:val="21"/>
+          <w:szCs w:val="21"/>
+        </w:rPr>
+      </w:pPr>
+      <w:r>
+        <w:rPr>
+          <w:rFonts w:asciiTheme="minorHAnsi" w:hAnsiTheme="minorHAnsi" w:cstheme="minorHAnsi"/>
+          <w:color w:val="1F2933"/>
+          <w:sz w:val="21"/>
+          <w:szCs w:val="21"/>
+        </w:rPr>
+        <w:t>The system must accept English text as input, either typed directly or uploaded as a file. It must translate the text into Hindi using a trained Encoder-Decoder model. It must display the translated output alongside the original English text for comparison. It must support both single-sentence translation and batch translation of multiple sentences from an uploaded file.</w:t>
+      </w:r>
+    </w:p>
+    <w:p>
+      <w:pPr>
+        <w:pStyle w:val="NormalWeb"/>
+        <w:rPr>
+          <w:rFonts w:asciiTheme="minorHAnsi" w:hAnsiTheme="minorHAnsi" w:cstheme="minorHAnsi"/>
+          <w:color w:val="1F2933"/>
+          <w:sz w:val="21"/>
+          <w:szCs w:val="21"/>
+        </w:rPr>
+      </w:pPr>
+      <w:r>
+        <w:rPr>
+          <w:rStyle w:val="Heading3Char"/>
+          <w:rFonts w:asciiTheme="minorHAnsi" w:hAnsiTheme="minorHAnsi" w:cstheme="minorHAnsi"/>
+        </w:rPr>
+        <w:t>Language pair and direction</w:t>
+      </w:r>
+    </w:p>
+    <w:p>
+      <w:pPr>
+        <w:pStyle w:val="NormalWeb"/>
+        <w:rPr>
+          <w:rFonts w:asciiTheme="minorHAnsi" w:hAnsiTheme="minorHAnsi" w:cstheme="minorHAnsi"/>
+          <w:color w:val="1F2933"/>
+          <w:sz w:val="21"/>
+          <w:szCs w:val="21"/>
+        </w:rPr>
+      </w:pPr>
+      <w:r>
+        <w:rPr>
+          <w:rFonts w:asciiTheme="minorHAnsi" w:hAnsiTheme="minorHAnsi" w:cstheme="minorHAnsi"/>
+          <w:color w:val="1F2933"/>
+          <w:sz w:val="21"/>
+          <w:szCs w:val="21"/>
+        </w:rPr>
+        <w:t>English (source) to Hindi (target), one-way translation only. No Hindi-to-English or reverse translation is supported.</w:t>
+      </w:r>
+    </w:p>
+    <w:p>
+      <w:pPr>
+        <w:pStyle w:val="NormalWeb"/>
+        <w:rPr>
+          <w:rFonts w:asciiTheme="minorHAnsi" w:hAnsiTheme="minorHAnsi" w:cstheme="minorHAnsi"/>
+          <w:color w:val="1F2933"/>
+          <w:sz w:val="21"/>
+          <w:szCs w:val="21"/>
+        </w:rPr>
+      </w:pPr>
+      <w:r>
+        <w:rPr>
+          <w:rStyle w:val="Heading3Char"/>
+          <w:rFonts w:asciiTheme="minorHAnsi" w:hAnsiTheme="minorHAnsi" w:cstheme="minorHAnsi"/>
+        </w:rPr>
+        <w:t>Input and output</w:t>
+      </w:r>
+    </w:p>
+    <w:p>
+      <w:pPr>
+        <w:pStyle w:val="NormalWeb"/>
+        <w:rPr>
+          <w:rFonts w:asciiTheme="minorHAnsi" w:hAnsiTheme="minorHAnsi" w:cstheme="minorHAnsi"/>
+          <w:color w:val="1F2933"/>
+          <w:sz w:val="21"/>
+          <w:szCs w:val="21"/>
+        </w:rPr>
+      </w:pPr>
+      <w:r>
+        <w:rPr>
+          <w:rFonts w:asciiTheme="minorHAnsi" w:hAnsiTheme="minorHAnsi" w:cstheme="minorHAnsi"/>
+          <w:color w:val="1F2933"/>
+          <w:sz w:val="21"/>
+          <w:szCs w:val="21"/>
+        </w:rPr>
+        <w:t>Input is English text, either a single sentence entered in a text box or a .txt file (one sentence per line) or .csv file (with an English-language column) for batch translation. Output is the corresponding Hindi translation, shown in the application interface next to the original English text, with batch results downloadable as a CSV file.</w:t>
+      </w:r>
+    </w:p>
+    <w:p>
+      <w:pPr>
+        <w:pStyle w:val="NormalWeb"/>
+        <w:rPr>
+          <w:rFonts w:ascii="Aptos" w:hAnsi="Aptos"/>
+          <w:color w:val="1F2933"/>
+          <w:sz w:val="21"/>
+          <w:szCs w:val="21"/>
+          <w:lang w:val="en"/>
+        </w:rPr>
+      </w:pPr>
+    </w:p>
+    <w:p>
+      <w:pPr>
         <w:pStyle w:val="Heading3"/>
         <w:rPr>
           <w:rFonts w:ascii="Aptos" w:eastAsia="Times New Roman" w:hAnsi="Aptos"/>
@@ -3318,27 +3504,7 @@
                 <w:sz w:val="18"/>
                 <w:szCs w:val="18"/>
               </w:rPr>
-              <w:t xml:space="preserve">Encoder-decoder </w:t>
-            </w:r>
-            <w:proofErr w:type="spellStart"/>
-            <w:r>
-              <w:rPr>
-                <w:rFonts w:ascii="Aptos" w:eastAsia="Times New Roman" w:hAnsi="Aptos"/>
-                <w:color w:val="1F2933"/>
-                <w:sz w:val="18"/>
-                <w:szCs w:val="18"/>
-              </w:rPr>
-              <w:t>PyTorch</w:t>
-            </w:r>
-            <w:proofErr w:type="spellEnd"/>
-            <w:r>
-              <w:rPr>
-                <w:rFonts w:ascii="Aptos" w:eastAsia="Times New Roman" w:hAnsi="Aptos"/>
-                <w:color w:val="1F2933"/>
-                <w:sz w:val="18"/>
-                <w:szCs w:val="18"/>
-              </w:rPr>
-              <w:t xml:space="preserve"> model with bidirectional encoding and additive attention.</w:t>
+              <w:t>Encoder-decoder PyTorch model with bidirectional encoding and additive attention.</w:t>
             </w:r>
           </w:p>
         </w:tc>
@@ -3487,7 +3653,6 @@
                 <w:szCs w:val="18"/>
               </w:rPr>
             </w:pPr>
-            <w:proofErr w:type="spellStart"/>
             <w:r>
               <w:rPr>
                 <w:rFonts w:ascii="Aptos" w:eastAsia="Times New Roman" w:hAnsi="Aptos"/>
@@ -3495,17 +3660,7 @@
                 <w:sz w:val="18"/>
                 <w:szCs w:val="18"/>
               </w:rPr>
-              <w:t>Streamlit</w:t>
-            </w:r>
-            <w:proofErr w:type="spellEnd"/>
-            <w:r>
-              <w:rPr>
-                <w:rFonts w:ascii="Aptos" w:eastAsia="Times New Roman" w:hAnsi="Aptos"/>
-                <w:color w:val="1F2933"/>
-                <w:sz w:val="18"/>
-                <w:szCs w:val="18"/>
-              </w:rPr>
-              <w:t xml:space="preserve"> app with single-sentence and batch upload workflows.</w:t>
+              <w:t>Streamlit app with single-sentence and batch upload workflows.</w:t>
             </w:r>
           </w:p>
         </w:tc>
@@ -3583,27 +3738,7 @@
                 <w:sz w:val="18"/>
                 <w:szCs w:val="18"/>
               </w:rPr>
-              <w:t xml:space="preserve">BLEU, </w:t>
-            </w:r>
-            <w:proofErr w:type="spellStart"/>
-            <w:r>
-              <w:rPr>
-                <w:rFonts w:ascii="Aptos" w:eastAsia="Times New Roman" w:hAnsi="Aptos"/>
-                <w:color w:val="1F2933"/>
-                <w:sz w:val="18"/>
-                <w:szCs w:val="18"/>
-              </w:rPr>
-              <w:t>chrF</w:t>
-            </w:r>
-            <w:proofErr w:type="spellEnd"/>
-            <w:r>
-              <w:rPr>
-                <w:rFonts w:ascii="Aptos" w:eastAsia="Times New Roman" w:hAnsi="Aptos"/>
-                <w:color w:val="1F2933"/>
-                <w:sz w:val="18"/>
-                <w:szCs w:val="18"/>
-              </w:rPr>
-              <w:t>, ROUGE-L, METEOR and targeted failure analysis.</w:t>
+              <w:t>BLEU, chrF, ROUGE-L, METEOR and targeted failure analysis.</w:t>
             </w:r>
           </w:p>
         </w:tc>
@@ -3644,6 +3779,7 @@
           <w:szCs w:val="21"/>
           <w:lang w:val="en"/>
         </w:rPr>
+        <w:lastRenderedPageBreak/>
         <w:t xml:space="preserve">The application accepts an English sentence directly or reads one sentence per line from a TXT file. It can also read a CSV file with an </w:t>
       </w:r>
       <w:r>
@@ -3665,16 +3801,6 @@
           <w:lang w:val="en"/>
         </w:rPr>
         <w:t xml:space="preserve"> column. Results are displayed alongside the source text and can be downloaded as a CSV file. Decoding can be switched between greedy search and beam search with a configurable beam width from 2 to 10.</w:t>
-      </w:r>
-      <w:r>
-        <w:rPr>
-          <w:rFonts w:ascii="Aptos" w:hAnsi="Aptos"/>
-          <w:color w:val="1F2933"/>
-          <w:sz w:val="21"/>
-          <w:szCs w:val="21"/>
-          <w:lang w:val="en"/>
-        </w:rPr>
-        <w:br w:type="page"/>
       </w:r>
     </w:p>
     <w:p>
@@ -4346,7 +4472,6 @@
                 <w:szCs w:val="18"/>
               </w:rPr>
             </w:pPr>
-            <w:proofErr w:type="spellStart"/>
             <w:r>
               <w:rPr>
                 <w:rStyle w:val="code1"/>
@@ -4355,18 +4480,7 @@
                 <w:sz w:val="18"/>
                 <w:szCs w:val="18"/>
               </w:rPr>
-              <w:t>min_freq</w:t>
-            </w:r>
-            <w:proofErr w:type="spellEnd"/>
-            <w:r>
-              <w:rPr>
-                <w:rStyle w:val="code1"/>
-                <w:rFonts w:eastAsia="Times New Roman"/>
-                <w:color w:val="1F2933"/>
-                <w:sz w:val="18"/>
-                <w:szCs w:val="18"/>
-              </w:rPr>
-              <w:t>=4</w:t>
+              <w:t>min_freq=4</w:t>
             </w:r>
             <w:r>
               <w:rPr>
@@ -4466,9 +4580,18 @@
           <w:szCs w:val="21"/>
           <w:lang w:val="en"/>
         </w:rPr>
-        <w:t>&lt;</w:t>
-      </w:r>
-      <w:proofErr w:type="spellStart"/>
+        <w:t>&lt;sos&gt;</w:t>
+      </w:r>
+      <w:r>
+        <w:rPr>
+          <w:rFonts w:ascii="Aptos" w:hAnsi="Aptos"/>
+          <w:color w:val="1F2933"/>
+          <w:sz w:val="21"/>
+          <w:szCs w:val="21"/>
+          <w:lang w:val="en"/>
+        </w:rPr>
+        <w:t xml:space="preserve"> and </w:t>
+      </w:r>
       <w:r>
         <w:rPr>
           <w:rStyle w:val="code1"/>
@@ -4477,18 +4600,7 @@
           <w:szCs w:val="21"/>
           <w:lang w:val="en"/>
         </w:rPr>
-        <w:t>sos</w:t>
-      </w:r>
-      <w:proofErr w:type="spellEnd"/>
-      <w:r>
-        <w:rPr>
-          <w:rStyle w:val="code1"/>
-          <w:color w:val="1F2933"/>
-          <w:sz w:val="21"/>
-          <w:szCs w:val="21"/>
-          <w:lang w:val="en"/>
-        </w:rPr>
-        <w:t>&gt;</w:t>
+        <w:t>&lt;eos&gt;</w:t>
       </w:r>
       <w:r>
         <w:rPr>
@@ -4498,41 +4610,28 @@
           <w:szCs w:val="21"/>
           <w:lang w:val="en"/>
         </w:rPr>
-        <w:t xml:space="preserve"> and </w:t>
-      </w:r>
-      <w:r>
-        <w:rPr>
-          <w:rStyle w:val="code1"/>
-          <w:color w:val="1F2933"/>
-          <w:sz w:val="21"/>
-          <w:szCs w:val="21"/>
-          <w:lang w:val="en"/>
-        </w:rPr>
-        <w:t>&lt;</w:t>
-      </w:r>
-      <w:proofErr w:type="spellStart"/>
-      <w:r>
-        <w:rPr>
-          <w:rStyle w:val="code1"/>
-          <w:color w:val="1F2933"/>
-          <w:sz w:val="21"/>
-          <w:szCs w:val="21"/>
-          <w:lang w:val="en"/>
-        </w:rPr>
-        <w:t>eos</w:t>
-      </w:r>
-      <w:proofErr w:type="spellEnd"/>
-      <w:r>
-        <w:rPr>
-          <w:rStyle w:val="code1"/>
-          <w:color w:val="1F2933"/>
-          <w:sz w:val="21"/>
-          <w:szCs w:val="21"/>
-          <w:lang w:val="en"/>
-        </w:rPr>
-        <w:t>&gt;</w:t>
-      </w:r>
-      <w:r>
+        <w:t>, encoded with the training vocabulary and right-padded to a fixed length of 34 tokens.</w:t>
+      </w:r>
+    </w:p>
+    <w:p>
+      <w:pPr>
+        <w:pStyle w:val="Heading3"/>
+        <w:rPr>
+          <w:rFonts w:ascii="Aptos" w:eastAsia="Times New Roman" w:hAnsi="Aptos"/>
+          <w:lang w:val="en"/>
+        </w:rPr>
+      </w:pPr>
+      <w:r>
+        <w:rPr>
+          <w:rFonts w:ascii="Aptos" w:eastAsia="Times New Roman" w:hAnsi="Aptos"/>
+          <w:lang w:val="en"/>
+        </w:rPr>
+        <w:t>Data flow</w:t>
+      </w:r>
+    </w:p>
+    <w:p>
+      <w:pPr>
+        <w:pStyle w:val="NormalWeb"/>
         <w:rPr>
           <w:rFonts w:ascii="Aptos" w:hAnsi="Aptos"/>
           <w:color w:val="1F2933"/>
@@ -4540,28 +4639,8 @@
           <w:szCs w:val="21"/>
           <w:lang w:val="en"/>
         </w:rPr>
-        <w:t>, encoded with the training vocabulary and right-padded to a fixed length of 34 tokens.</w:t>
-      </w:r>
-    </w:p>
-    <w:p>
-      <w:pPr>
-        <w:pStyle w:val="Heading3"/>
-        <w:rPr>
-          <w:rFonts w:ascii="Aptos" w:eastAsia="Times New Roman" w:hAnsi="Aptos"/>
-          <w:lang w:val="en"/>
-        </w:rPr>
-      </w:pPr>
-      <w:r>
-        <w:rPr>
-          <w:rFonts w:ascii="Aptos" w:eastAsia="Times New Roman" w:hAnsi="Aptos"/>
-          <w:lang w:val="en"/>
-        </w:rPr>
-        <w:t>Data flow</w:t>
-      </w:r>
-    </w:p>
-    <w:p>
-      <w:pPr>
-        <w:pStyle w:val="NormalWeb"/>
+      </w:pPr>
+      <w:r>
         <w:rPr>
           <w:rFonts w:ascii="Aptos" w:hAnsi="Aptos"/>
           <w:color w:val="1F2933"/>
@@ -4569,82 +4648,7 @@
           <w:szCs w:val="21"/>
           <w:lang w:val="en"/>
         </w:rPr>
-      </w:pPr>
-      <w:r>
-        <w:rPr>
-          <w:rFonts w:ascii="Aptos" w:hAnsi="Aptos"/>
-          <w:color w:val="1F2933"/>
-          <w:sz w:val="21"/>
-          <w:szCs w:val="21"/>
-          <w:lang w:val="en"/>
-        </w:rPr>
-        <w:t xml:space="preserve">Raw corpus → cleaned sentence pairs → 80/10/10 split → training-only vocabularies → integer ID matrices → </w:t>
-      </w:r>
-      <w:proofErr w:type="spellStart"/>
-      <w:r>
-        <w:rPr>
-          <w:rFonts w:ascii="Aptos" w:hAnsi="Aptos"/>
-          <w:color w:val="1F2933"/>
-          <w:sz w:val="21"/>
-          <w:szCs w:val="21"/>
-          <w:lang w:val="en"/>
-        </w:rPr>
-        <w:t>PyTorch</w:t>
-      </w:r>
-      <w:proofErr w:type="spellEnd"/>
-      <w:r>
-        <w:rPr>
-          <w:rFonts w:ascii="Aptos" w:hAnsi="Aptos"/>
-          <w:color w:val="1F2933"/>
-          <w:sz w:val="21"/>
-          <w:szCs w:val="21"/>
-          <w:lang w:val="en"/>
-        </w:rPr>
-        <w:t xml:space="preserve"> </w:t>
-      </w:r>
-      <w:proofErr w:type="spellStart"/>
-      <w:r>
-        <w:rPr>
-          <w:rFonts w:ascii="Aptos" w:hAnsi="Aptos"/>
-          <w:color w:val="1F2933"/>
-          <w:sz w:val="21"/>
-          <w:szCs w:val="21"/>
-          <w:lang w:val="en"/>
-        </w:rPr>
-        <w:t>DataLoaders</w:t>
-      </w:r>
-      <w:proofErr w:type="spellEnd"/>
-      <w:r>
-        <w:rPr>
-          <w:rFonts w:ascii="Aptos" w:hAnsi="Aptos"/>
-          <w:color w:val="1F2933"/>
-          <w:sz w:val="21"/>
-          <w:szCs w:val="21"/>
-          <w:lang w:val="en"/>
-        </w:rPr>
-        <w:t xml:space="preserve"> → trained checkpoint → CLI and </w:t>
-      </w:r>
-      <w:proofErr w:type="spellStart"/>
-      <w:r>
-        <w:rPr>
-          <w:rFonts w:ascii="Aptos" w:hAnsi="Aptos"/>
-          <w:color w:val="1F2933"/>
-          <w:sz w:val="21"/>
-          <w:szCs w:val="21"/>
-          <w:lang w:val="en"/>
-        </w:rPr>
-        <w:t>Streamlit</w:t>
-      </w:r>
-      <w:proofErr w:type="spellEnd"/>
-      <w:r>
-        <w:rPr>
-          <w:rFonts w:ascii="Aptos" w:hAnsi="Aptos"/>
-          <w:color w:val="1F2933"/>
-          <w:sz w:val="21"/>
-          <w:szCs w:val="21"/>
-          <w:lang w:val="en"/>
-        </w:rPr>
-        <w:t xml:space="preserve"> inference.</w:t>
+        <w:t>Raw corpus → cleaned sentence pairs → 80/10/10 split → training-only vocabularies → integer ID matrices → PyTorch DataLoaders → trained checkpoint → CLI and Streamlit inference.</w:t>
       </w:r>
       <w:r>
         <w:rPr>
@@ -4986,29 +4990,7 @@
                 <w:sz w:val="18"/>
                 <w:szCs w:val="18"/>
               </w:rPr>
-              <w:t>python run_pipeline.py --</w:t>
-            </w:r>
-            <w:proofErr w:type="spellStart"/>
-            <w:r>
-              <w:rPr>
-                <w:rStyle w:val="code1"/>
-                <w:rFonts w:eastAsia="Times New Roman"/>
-                <w:color w:val="1F2933"/>
-                <w:sz w:val="18"/>
-                <w:szCs w:val="18"/>
-              </w:rPr>
-              <w:t>min_freq</w:t>
-            </w:r>
-            <w:proofErr w:type="spellEnd"/>
-            <w:r>
-              <w:rPr>
-                <w:rStyle w:val="code1"/>
-                <w:rFonts w:eastAsia="Times New Roman"/>
-                <w:color w:val="1F2933"/>
-                <w:sz w:val="18"/>
-                <w:szCs w:val="18"/>
-              </w:rPr>
-              <w:t xml:space="preserve"> 4</w:t>
+              <w:t>python run_pipeline.py --min_freq 4</w:t>
             </w:r>
           </w:p>
         </w:tc>
@@ -5262,29 +5244,7 @@
                 <w:sz w:val="18"/>
                 <w:szCs w:val="18"/>
               </w:rPr>
-              <w:t>python evaluate.py --</w:t>
-            </w:r>
-            <w:proofErr w:type="spellStart"/>
-            <w:r>
-              <w:rPr>
-                <w:rStyle w:val="code1"/>
-                <w:rFonts w:eastAsia="Times New Roman"/>
-                <w:color w:val="1F2933"/>
-                <w:sz w:val="18"/>
-                <w:szCs w:val="18"/>
-              </w:rPr>
-              <w:t>n_samples</w:t>
-            </w:r>
-            <w:proofErr w:type="spellEnd"/>
-            <w:r>
-              <w:rPr>
-                <w:rStyle w:val="code1"/>
-                <w:rFonts w:eastAsia="Times New Roman"/>
-                <w:color w:val="1F2933"/>
-                <w:sz w:val="18"/>
-                <w:szCs w:val="18"/>
-              </w:rPr>
-              <w:t xml:space="preserve"> 500</w:t>
+              <w:t>python evaluate.py --n_samples 500</w:t>
             </w:r>
           </w:p>
         </w:tc>
@@ -5332,20 +5292,8 @@
                 <w:sz w:val="18"/>
                 <w:szCs w:val="18"/>
               </w:rPr>
-              <w:t>media/</w:t>
+              <w:t>media/eval_report.json</w:t>
             </w:r>
-            <w:proofErr w:type="spellStart"/>
-            <w:r>
-              <w:rPr>
-                <w:rStyle w:val="code1"/>
-                <w:rFonts w:eastAsia="Times New Roman"/>
-                <w:color w:val="1F2933"/>
-                <w:sz w:val="18"/>
-                <w:szCs w:val="18"/>
-              </w:rPr>
-              <w:t>eval_report.json</w:t>
-            </w:r>
-            <w:proofErr w:type="spellEnd"/>
           </w:p>
         </w:tc>
       </w:tr>
@@ -5532,7 +5480,6 @@
                 <w:szCs w:val="18"/>
               </w:rPr>
             </w:pPr>
-            <w:proofErr w:type="spellStart"/>
             <w:r>
               <w:rPr>
                 <w:rStyle w:val="code1"/>
@@ -5541,18 +5488,7 @@
                 <w:sz w:val="18"/>
                 <w:szCs w:val="18"/>
               </w:rPr>
-              <w:t>streamlit</w:t>
-            </w:r>
-            <w:proofErr w:type="spellEnd"/>
-            <w:r>
-              <w:rPr>
-                <w:rStyle w:val="code1"/>
-                <w:rFonts w:eastAsia="Times New Roman"/>
-                <w:color w:val="1F2933"/>
-                <w:sz w:val="18"/>
-                <w:szCs w:val="18"/>
-              </w:rPr>
-              <w:t xml:space="preserve"> run app.py</w:t>
+              <w:t>streamlit run app.py</w:t>
             </w:r>
           </w:p>
         </w:tc>
@@ -5702,29 +5638,7 @@
           <w:szCs w:val="21"/>
           <w:lang w:val="en"/>
         </w:rPr>
-        <w:t xml:space="preserve">At each decoding step, </w:t>
-      </w:r>
-      <w:proofErr w:type="spellStart"/>
-      <w:r>
-        <w:rPr>
-          <w:rFonts w:ascii="Aptos" w:hAnsi="Aptos"/>
-          <w:color w:val="1F2933"/>
-          <w:sz w:val="21"/>
-          <w:szCs w:val="21"/>
-          <w:lang w:val="en"/>
-        </w:rPr>
-        <w:t>Bahdanau</w:t>
-      </w:r>
-      <w:proofErr w:type="spellEnd"/>
-      <w:r>
-        <w:rPr>
-          <w:rFonts w:ascii="Aptos" w:hAnsi="Aptos"/>
-          <w:color w:val="1F2933"/>
-          <w:sz w:val="21"/>
-          <w:szCs w:val="21"/>
-          <w:lang w:val="en"/>
-        </w:rPr>
-        <w:t xml:space="preserve"> additive attention scores every encoder output against the current decoder hidden state. The resulting context vector is concatenated with the current target embedding and passed to an LSTM. The decoder output, attention context and embedding are combined by a linear projection into the Hindi vocabulary distribution.</w:t>
+        <w:t>At each decoding step, Bahdanau additive attention scores every encoder output against the current decoder hidden state. The resulting context vector is concatenated with the current target embedding and passed to an LSTM. The decoder output, attention context and embedding are combined by a linear projection into the Hindi vocabulary distribution.</w:t>
       </w:r>
     </w:p>
     <w:p>
@@ -6239,7 +6153,7 @@
                 <w:sz w:val="18"/>
                 <w:szCs w:val="18"/>
               </w:rPr>
-              <w:t xml:space="preserve">6; </w:t>
+              <w:t>6</w:t>
             </w:r>
           </w:p>
         </w:tc>
@@ -6414,6 +6328,7 @@
       <w:r>
         <w:rPr>
           <w:rFonts w:ascii="Aptos" w:eastAsia="Times New Roman" w:hAnsi="Aptos"/>
+          <w:noProof/>
           <w:color w:val="53666F"/>
           <w:sz w:val="18"/>
           <w:szCs w:val="18"/>
@@ -6637,31 +6552,7 @@
           <w:szCs w:val="21"/>
           <w:lang w:val="en"/>
         </w:rPr>
-        <w:t xml:space="preserve">Model training and inference execution in the BITS Virtual </w:t>
-      </w:r>
-      <w:proofErr w:type="gramStart"/>
-      <w:r>
-        <w:rPr>
-          <w:rFonts w:ascii="Aptos" w:hAnsi="Aptos" w:cs="Times New Roman"/>
-          <w:color w:val="1F2933"/>
-          <w:kern w:val="0"/>
-          <w:sz w:val="21"/>
-          <w:szCs w:val="21"/>
-          <w:lang w:val="en"/>
-        </w:rPr>
-        <w:t>Lab :</w:t>
-      </w:r>
-      <w:proofErr w:type="gramEnd"/>
-      <w:r>
-        <w:rPr>
-          <w:rFonts w:ascii="Aptos" w:hAnsi="Aptos" w:cs="Times New Roman"/>
-          <w:color w:val="1F2933"/>
-          <w:kern w:val="0"/>
-          <w:sz w:val="21"/>
-          <w:szCs w:val="21"/>
-          <w:lang w:val="en"/>
-        </w:rPr>
-        <w:t xml:space="preserve"> The screenshots show the successful execution of the NMT model in the BITS Virtual Lab, including model training, checkpoint saving, and sample English-to-Hindi translations.</w:t>
+        <w:t>Model training and inference execution in the BITS Virtual Lab : The screenshots show the successful execution of the NMT model in the BITS Virtual Lab, including model training, checkpoint saving, and sample English-to-Hindi translations.</w:t>
       </w:r>
       <w:r>
         <w:rPr>
@@ -6681,7 +6572,7 @@
           <w:noProof/>
         </w:rPr>
         <w:drawing>
-          <wp:inline distT="0" distB="0" distL="0" distR="0" wp14:anchorId="26984DA7" wp14:editId="56427B1B">
+          <wp:inline distT="0" distB="0" distL="0" distR="0" wp14:anchorId="26984DA7" wp14:editId="4E453AD5">
             <wp:extent cx="5730240" cy="3223260"/>
             <wp:effectExtent l="0" t="0" r="3810" b="0"/>
             <wp:docPr id="394352691" name="Picture 3631"/>
@@ -6755,7 +6646,7 @@
           <w:noProof/>
         </w:rPr>
         <w:drawing>
-          <wp:inline distT="0" distB="0" distL="0" distR="0" wp14:anchorId="5FA86DEE" wp14:editId="3FDFD27E">
+          <wp:inline distT="0" distB="0" distL="0" distR="0" wp14:anchorId="5FA86DEE" wp14:editId="2569288C">
             <wp:extent cx="5730240" cy="3223260"/>
             <wp:effectExtent l="0" t="0" r="0" b="0"/>
             <wp:docPr id="433776544" name="Picture 3632"/>
@@ -6921,29 +6812,7 @@
           <w:szCs w:val="18"/>
           <w:lang w:val="en"/>
         </w:rPr>
-        <w:t xml:space="preserve">Figure 3. Single-sentence input screen with the sample how </w:t>
-      </w:r>
-      <w:proofErr w:type="gramStart"/>
-      <w:r>
-        <w:rPr>
-          <w:rFonts w:ascii="Aptos" w:eastAsia="Times New Roman" w:hAnsi="Aptos"/>
-          <w:color w:val="53666F"/>
-          <w:sz w:val="18"/>
-          <w:szCs w:val="18"/>
-          <w:lang w:val="en"/>
-        </w:rPr>
-        <w:t>are</w:t>
-      </w:r>
-      <w:proofErr w:type="gramEnd"/>
-      <w:r>
-        <w:rPr>
-          <w:rFonts w:ascii="Aptos" w:eastAsia="Times New Roman" w:hAnsi="Aptos"/>
-          <w:color w:val="53666F"/>
-          <w:sz w:val="18"/>
-          <w:szCs w:val="18"/>
-          <w:lang w:val="en"/>
-        </w:rPr>
-        <w:t xml:space="preserve"> you, </w:t>
+        <w:t xml:space="preserve">Figure 3. Single-sentence input screen with the sample how are you, </w:t>
       </w:r>
       <w:r>
         <w:rPr>
@@ -7433,10 +7302,12 @@
           <w:szCs w:val="21"/>
           <w:lang w:val="en"/>
         </w:rPr>
-        <w:t xml:space="preserve">3. Short and medium inputs have similar </w:t>
-      </w:r>
-      <w:proofErr w:type="spellStart"/>
-      <w:r>
+        <w:t>3. Short and medium inputs have similar chrF performance, while long inputs are slightly weaker. This is consistent with the sequential model needing to preserve more context over longer and more complex sentences.</w:t>
+      </w:r>
+    </w:p>
+    <w:p>
+      <w:pPr>
+        <w:pStyle w:val="NormalWeb"/>
         <w:rPr>
           <w:rFonts w:ascii="Aptos" w:hAnsi="Aptos"/>
           <w:color w:val="1F2933"/>
@@ -7444,9 +7315,7 @@
           <w:szCs w:val="21"/>
           <w:lang w:val="en"/>
         </w:rPr>
-        <w:t>chrF</w:t>
-      </w:r>
-      <w:proofErr w:type="spellEnd"/>
+      </w:pPr>
       <w:r>
         <w:rPr>
           <w:rFonts w:ascii="Aptos" w:hAnsi="Aptos"/>
@@ -7455,7 +7324,23 @@
           <w:szCs w:val="21"/>
           <w:lang w:val="en"/>
         </w:rPr>
-        <w:t xml:space="preserve"> performance, while long inputs are slightly weaker. This is consistent with the sequential model needing to preserve more context over longer and more complex sentences.</w:t>
+        <w:t>4. The no-repeat constraints are effective against decoding loops, but they cannot solve vocabulary coverage. Unknown-token output remains the primary quality limitation.</w:t>
+      </w:r>
+    </w:p>
+    <w:p>
+      <w:pPr>
+        <w:pStyle w:val="Heading3"/>
+        <w:rPr>
+          <w:rFonts w:ascii="Aptos" w:eastAsia="Times New Roman" w:hAnsi="Aptos"/>
+          <w:lang w:val="en"/>
+        </w:rPr>
+      </w:pPr>
+      <w:r>
+        <w:rPr>
+          <w:rFonts w:ascii="Aptos" w:eastAsia="Times New Roman" w:hAnsi="Aptos"/>
+          <w:lang w:val="en"/>
+        </w:rPr>
+        <w:t>Limitations</w:t>
       </w:r>
     </w:p>
     <w:p>
@@ -7477,23 +7362,21 @@
           <w:szCs w:val="21"/>
           <w:lang w:val="en"/>
         </w:rPr>
-        <w:t>4. The no-repeat constraints are effective against decoding loops, but they cannot solve vocabulary coverage. Unknown-token output remains the primary quality limitation.</w:t>
+        <w:t>The model was trained on approximately 36,000 training pairs after cleaning, with a minimum vocabulary frequency of four. Rare words and named entities can therefore map to unknown tokens or be mistranslated. The submitted checkpoint is a compact assignment-scale model rather than a production translation system. The application also relies on the included local artifacts; regenerating the dataset requires internet access to Hugging Face.</w:t>
       </w:r>
     </w:p>
     <w:p>
       <w:pPr>
         <w:pStyle w:val="Heading3"/>
         <w:rPr>
-          <w:rFonts w:ascii="Aptos" w:eastAsia="Times New Roman" w:hAnsi="Aptos"/>
-          <w:lang w:val="en"/>
-        </w:rPr>
-      </w:pPr>
-      <w:r>
-        <w:rPr>
-          <w:rFonts w:ascii="Aptos" w:eastAsia="Times New Roman" w:hAnsi="Aptos"/>
-          <w:lang w:val="en"/>
-        </w:rPr>
-        <w:t>Limitations</w:t>
+          <w:rFonts w:asciiTheme="minorHAnsi" w:hAnsiTheme="minorHAnsi" w:cstheme="minorHAnsi"/>
+        </w:rPr>
+      </w:pPr>
+      <w:r>
+        <w:rPr>
+          <w:rFonts w:asciiTheme="minorHAnsi" w:hAnsiTheme="minorHAnsi" w:cstheme="minorHAnsi"/>
+        </w:rPr>
+        <w:t>Word order</w:t>
       </w:r>
     </w:p>
     <w:p>
@@ -7513,9 +7396,8 @@
           <w:color w:val="1F2933"/>
           <w:sz w:val="21"/>
           <w:szCs w:val="21"/>
-          <w:lang w:val="en"/>
-        </w:rPr>
-        <w:t>The model was trained on approximately 36,000 training pairs after cleaning, with a minimum vocabulary frequency of four. Rare words and named entities can therefore map to unknown tokens or be mistranslated. The submitted checkpoint is a compact assignment-scale model rather than a production translation system. The application also relies on the included local artifacts; regenerating the dataset requires internet access to Hugging Face.</w:t>
+        </w:rPr>
+        <w:t>English follows a subject-verb-object structure, while Hindi follows a subject-object-verb structure. Correct translation therefore requires reordering sentence constituents rather than mapping words one to one in the original sequence. Several outputs in this evaluation show this failure mode. In the example "the government has announced a new policy for farmers," the generated output repeats the subject "sarkar" (government) at multiple positions instead of placing the verb and object in a single, correctly ordered Hindi clause. This is a distinct issue from vocabulary coverage, since the model here uses known, in-vocabulary words but fails to arrange them in a grammatically valid sequence. It reflects the limited capacity of the BiLSTM encoder-decoder to learn long-range structural reordering from a training set of this size, and it becomes more pronounced in longer sentences with multiple clauses.</w:t>
       </w:r>
     </w:p>
     <w:p>
@@ -7565,10 +7447,12 @@
           <w:szCs w:val="21"/>
           <w:lang w:val="en"/>
         </w:rPr>
-        <w:t xml:space="preserve">An end-to-end English-to-Hindi NMT system was implemented, evaluated and integrated into a usable </w:t>
-      </w:r>
-      <w:proofErr w:type="spellStart"/>
-      <w:r>
+        <w:t>An end-to-end English-to-Hindi NMT system was implemented, evaluated and integrated into a usable Streamlit application. The repository now clearly separates preparation, training, evaluation, inference, application code and generated artifacts. The submitted model produces valid Hindi output for some common inputs and supports useful operational workflows such as beam decoding and batch CSV export.</w:t>
+      </w:r>
+    </w:p>
+    <w:p>
+      <w:pPr>
+        <w:pStyle w:val="NormalWeb"/>
         <w:rPr>
           <w:rFonts w:ascii="Aptos" w:hAnsi="Aptos"/>
           <w:color w:val="1F2933"/>
@@ -7576,9 +7460,7 @@
           <w:szCs w:val="21"/>
           <w:lang w:val="en"/>
         </w:rPr>
-        <w:t>Streamlit</w:t>
-      </w:r>
-      <w:proofErr w:type="spellEnd"/>
+      </w:pPr>
       <w:r>
         <w:rPr>
           <w:rFonts w:ascii="Aptos" w:hAnsi="Aptos"/>
@@ -7587,12 +7469,9 @@
           <w:szCs w:val="21"/>
           <w:lang w:val="en"/>
         </w:rPr>
-        <w:t xml:space="preserve"> application. The repository now clearly separates preparation, training, evaluation, inference, application code and generated artifacts. The submitted model produces valid Hindi output for some common inputs and supports useful operational workflows such as beam decoding and batch CSV export.</w:t>
-      </w:r>
-    </w:p>
-    <w:p>
-      <w:pPr>
-        <w:pStyle w:val="NormalWeb"/>
+        <w:t>The measured scores and failure analysis show that the project meets the implementation objective while also making its quality boundaries explicit. The strongest next step is subword-based modeling with broader data, which should directly address the observed 88.</w:t>
+      </w:r>
+      <w:r>
         <w:rPr>
           <w:rFonts w:ascii="Aptos" w:hAnsi="Aptos"/>
           <w:color w:val="1F2933"/>
@@ -7600,7 +7479,8 @@
           <w:szCs w:val="21"/>
           <w:lang w:val="en"/>
         </w:rPr>
-      </w:pPr>
+        <w:t>8</w:t>
+      </w:r>
       <w:r>
         <w:rPr>
           <w:rFonts w:ascii="Aptos" w:hAnsi="Aptos"/>
@@ -7609,29 +7489,7 @@
           <w:szCs w:val="21"/>
           <w:lang w:val="en"/>
         </w:rPr>
-        <w:t xml:space="preserve">The measured scores and failure analysis show that the project meets the implementation objective while also making its quality boundaries explicit. The strongest next step is </w:t>
-      </w:r>
-      <w:proofErr w:type="spellStart"/>
-      <w:r>
-        <w:rPr>
-          <w:rFonts w:ascii="Aptos" w:hAnsi="Aptos"/>
-          <w:color w:val="1F2933"/>
-          <w:sz w:val="21"/>
-          <w:szCs w:val="21"/>
-          <w:lang w:val="en"/>
-        </w:rPr>
-        <w:t>subword</w:t>
-      </w:r>
-      <w:proofErr w:type="spellEnd"/>
-      <w:r>
-        <w:rPr>
-          <w:rFonts w:ascii="Aptos" w:hAnsi="Aptos"/>
-          <w:color w:val="1F2933"/>
-          <w:sz w:val="21"/>
-          <w:szCs w:val="21"/>
-          <w:lang w:val="en"/>
-        </w:rPr>
-        <w:t>-based modeling with broader data, which should directly address the observed 88.2 percent unknown-token rate and improve named-entity and long-sentence translation.</w:t>
+        <w:t xml:space="preserve"> percent unknown-token rate and improve named-entity and long-sentence translation.</w:t>
       </w:r>
     </w:p>
     <w:p>
@@ -7692,29 +7550,7 @@
           <w:szCs w:val="21"/>
           <w:lang w:val="en"/>
         </w:rPr>
-        <w:t xml:space="preserve">[1] AI4Bharat, </w:t>
-      </w:r>
-      <w:proofErr w:type="spellStart"/>
-      <w:r>
-        <w:rPr>
-          <w:rFonts w:ascii="Aptos" w:hAnsi="Aptos"/>
-          <w:color w:val="1F2933"/>
-          <w:sz w:val="21"/>
-          <w:szCs w:val="21"/>
-          <w:lang w:val="en"/>
-        </w:rPr>
-        <w:t>Samanantar</w:t>
-      </w:r>
-      <w:proofErr w:type="spellEnd"/>
-      <w:r>
-        <w:rPr>
-          <w:rFonts w:ascii="Aptos" w:hAnsi="Aptos"/>
-          <w:color w:val="1F2933"/>
-          <w:sz w:val="21"/>
-          <w:szCs w:val="21"/>
-          <w:lang w:val="en"/>
-        </w:rPr>
-        <w:t xml:space="preserve">: English-Hindi parallel corpus, Hugging Face Datasets, </w:t>
+        <w:t xml:space="preserve">[1] AI4Bharat, Samanantar: English-Hindi parallel corpus, Hugging Face Datasets, </w:t>
       </w:r>
       <w:hyperlink r:id="rId16" w:history="1">
         <w:r>
@@ -7759,9 +7595,8 @@
           <w:szCs w:val="21"/>
           <w:lang w:val="en"/>
         </w:rPr>
-        <w:t xml:space="preserve">[2] </w:t>
-      </w:r>
-      <w:proofErr w:type="spellStart"/>
+        <w:t xml:space="preserve">[2] Bahdanau, D., Cho, K. and Bengio, Y., Neural Machine Translation by Jointly Learning to Align and </w:t>
+      </w:r>
       <w:r>
         <w:rPr>
           <w:rFonts w:ascii="Aptos" w:hAnsi="Aptos"/>
@@ -7770,9 +7605,8 @@
           <w:szCs w:val="21"/>
           <w:lang w:val="en"/>
         </w:rPr>
-        <w:t>Bahdanau</w:t>
-      </w:r>
-      <w:proofErr w:type="spellEnd"/>
+        <w:t xml:space="preserve"> </w:t>
+      </w:r>
       <w:r>
         <w:rPr>
           <w:rFonts w:ascii="Aptos" w:hAnsi="Aptos"/>
@@ -7781,49 +7615,7 @@
           <w:szCs w:val="21"/>
           <w:lang w:val="en"/>
         </w:rPr>
-        <w:t xml:space="preserve">, D., Cho, K. and Bengio, Y., Neural Machine Translation by Jointly Learning to Align </w:t>
-      </w:r>
-      <w:proofErr w:type="gramStart"/>
-      <w:r>
-        <w:rPr>
-          <w:rFonts w:ascii="Aptos" w:hAnsi="Aptos"/>
-          <w:color w:val="1F2933"/>
-          <w:sz w:val="21"/>
-          <w:szCs w:val="21"/>
-          <w:lang w:val="en"/>
-        </w:rPr>
-        <w:t xml:space="preserve">and </w:t>
-      </w:r>
-      <w:r>
-        <w:rPr>
-          <w:rFonts w:ascii="Aptos" w:hAnsi="Aptos"/>
-          <w:color w:val="1F2933"/>
-          <w:sz w:val="21"/>
-          <w:szCs w:val="21"/>
-          <w:lang w:val="en"/>
-        </w:rPr>
-        <w:t xml:space="preserve"> </w:t>
-      </w:r>
-      <w:r>
-        <w:rPr>
-          <w:rFonts w:ascii="Aptos" w:hAnsi="Aptos"/>
-          <w:color w:val="1F2933"/>
-          <w:sz w:val="21"/>
-          <w:szCs w:val="21"/>
-          <w:lang w:val="en"/>
-        </w:rPr>
-        <w:t>Translate</w:t>
-      </w:r>
-      <w:proofErr w:type="gramEnd"/>
-      <w:r>
-        <w:rPr>
-          <w:rFonts w:ascii="Aptos" w:hAnsi="Aptos"/>
-          <w:color w:val="1F2933"/>
-          <w:sz w:val="21"/>
-          <w:szCs w:val="21"/>
-          <w:lang w:val="en"/>
-        </w:rPr>
-        <w:t>, ICLR, 2015.</w:t>
+        <w:t>Translate, ICLR, 2015.</w:t>
       </w:r>
     </w:p>
     <w:p>
@@ -7846,6 +7638,7 @@
           <w:szCs w:val="21"/>
           <w:lang w:val="en"/>
         </w:rPr>
+        <w:lastRenderedPageBreak/>
         <w:t xml:space="preserve">       </w:t>
       </w:r>
       <w:r>
@@ -7856,29 +7649,7 @@
           <w:szCs w:val="21"/>
           <w:lang w:val="en"/>
         </w:rPr>
-        <w:t xml:space="preserve">[3] </w:t>
-      </w:r>
-      <w:proofErr w:type="spellStart"/>
-      <w:r>
-        <w:rPr>
-          <w:rFonts w:ascii="Aptos" w:hAnsi="Aptos"/>
-          <w:color w:val="1F2933"/>
-          <w:sz w:val="21"/>
-          <w:szCs w:val="21"/>
-          <w:lang w:val="en"/>
-        </w:rPr>
-        <w:t>PyTorch</w:t>
-      </w:r>
-      <w:proofErr w:type="spellEnd"/>
-      <w:r>
-        <w:rPr>
-          <w:rFonts w:ascii="Aptos" w:hAnsi="Aptos"/>
-          <w:color w:val="1F2933"/>
-          <w:sz w:val="21"/>
-          <w:szCs w:val="21"/>
-          <w:lang w:val="en"/>
-        </w:rPr>
-        <w:t xml:space="preserve"> Documentation, Sequence Models and Recurrent Neural Networks, https://pytorch.org/docs/</w:t>
+        <w:t>[3] PyTorch Documentation, Sequence Models and Recurrent Neural Networks, https://pytorch.org/docs/</w:t>
       </w:r>
     </w:p>
     <w:p>
@@ -7911,29 +7682,7 @@
           <w:szCs w:val="21"/>
           <w:lang w:val="en"/>
         </w:rPr>
-        <w:t xml:space="preserve">[4] </w:t>
-      </w:r>
-      <w:proofErr w:type="spellStart"/>
-      <w:r>
-        <w:rPr>
-          <w:rFonts w:ascii="Aptos" w:hAnsi="Aptos"/>
-          <w:color w:val="1F2933"/>
-          <w:sz w:val="21"/>
-          <w:szCs w:val="21"/>
-          <w:lang w:val="en"/>
-        </w:rPr>
-        <w:t>Streamlit</w:t>
-      </w:r>
-      <w:proofErr w:type="spellEnd"/>
-      <w:r>
-        <w:rPr>
-          <w:rFonts w:ascii="Aptos" w:hAnsi="Aptos"/>
-          <w:color w:val="1F2933"/>
-          <w:sz w:val="21"/>
-          <w:szCs w:val="21"/>
-          <w:lang w:val="en"/>
-        </w:rPr>
-        <w:t xml:space="preserve"> Documentation, Build and deploy data apps, https://docs.streamlit.io/</w:t>
+        <w:t>[4] Streamlit Documentation, Build and deploy data apps, https://docs.streamlit.io/</w:t>
       </w:r>
     </w:p>
     <w:p>
@@ -8094,71 +7843,6 @@
     </w:p>
     <w:p>
       <w:pPr>
-        <w:pStyle w:val="ref"/>
-        <w:spacing w:before="0" w:beforeAutospacing="0"/>
-        <w:rPr>
-          <w:rFonts w:ascii="Aptos" w:hAnsi="Aptos"/>
-          <w:color w:val="1F2933"/>
-          <w:sz w:val="21"/>
-          <w:szCs w:val="21"/>
-          <w:lang w:val="en"/>
-        </w:rPr>
-      </w:pPr>
-    </w:p>
-    <w:p>
-      <w:pPr>
-        <w:pStyle w:val="ref"/>
-        <w:spacing w:before="0" w:beforeAutospacing="0"/>
-        <w:rPr>
-          <w:rFonts w:ascii="Aptos" w:hAnsi="Aptos"/>
-          <w:color w:val="1F2933"/>
-          <w:sz w:val="21"/>
-          <w:szCs w:val="21"/>
-          <w:lang w:val="en"/>
-        </w:rPr>
-      </w:pPr>
-    </w:p>
-    <w:p>
-      <w:pPr>
-        <w:pStyle w:val="ref"/>
-        <w:spacing w:before="0" w:beforeAutospacing="0"/>
-        <w:rPr>
-          <w:rFonts w:ascii="Aptos" w:hAnsi="Aptos"/>
-          <w:color w:val="1F2933"/>
-          <w:sz w:val="21"/>
-          <w:szCs w:val="21"/>
-          <w:lang w:val="en"/>
-        </w:rPr>
-      </w:pPr>
-    </w:p>
-    <w:p>
-      <w:pPr>
-        <w:pStyle w:val="ref"/>
-        <w:spacing w:before="0" w:beforeAutospacing="0"/>
-        <w:rPr>
-          <w:rFonts w:ascii="Aptos" w:hAnsi="Aptos"/>
-          <w:color w:val="1F2933"/>
-          <w:sz w:val="21"/>
-          <w:szCs w:val="21"/>
-          <w:lang w:val="en"/>
-        </w:rPr>
-      </w:pPr>
-    </w:p>
-    <w:p>
-      <w:pPr>
-        <w:pStyle w:val="ref"/>
-        <w:spacing w:before="0" w:beforeAutospacing="0"/>
-        <w:rPr>
-          <w:rFonts w:ascii="Aptos" w:hAnsi="Aptos"/>
-          <w:color w:val="1F2933"/>
-          <w:sz w:val="21"/>
-          <w:szCs w:val="21"/>
-          <w:lang w:val="en"/>
-        </w:rPr>
-      </w:pPr>
-    </w:p>
-    <w:p>
-      <w:pPr>
         <w:pStyle w:val="Heading3"/>
         <w:rPr>
           <w:rFonts w:ascii="Aptos" w:eastAsia="Times New Roman" w:hAnsi="Aptos"/>
@@ -8190,7 +7874,7 @@
           <w:noProof/>
         </w:rPr>
         <w:drawing>
-          <wp:inline distT="0" distB="0" distL="0" distR="0" wp14:anchorId="17E0668E" wp14:editId="16CB2443">
+          <wp:inline distT="0" distB="0" distL="0" distR="0" wp14:anchorId="177E996B" wp14:editId="6ED05AEF">
             <wp:extent cx="6262231" cy="2755232"/>
             <wp:effectExtent l="0" t="0" r="0" b="0"/>
             <wp:docPr id="72621" name="Picture 72621"/>
@@ -8249,29 +7933,7 @@
           <w:szCs w:val="18"/>
           <w:lang w:val="en"/>
         </w:rPr>
-        <w:t xml:space="preserve">Figure 6. Final application capture: </w:t>
-      </w:r>
-      <w:proofErr w:type="spellStart"/>
-      <w:r>
-        <w:rPr>
-          <w:rFonts w:ascii="Aptos" w:eastAsia="Times New Roman" w:hAnsi="Aptos"/>
-          <w:color w:val="53666F"/>
-          <w:sz w:val="18"/>
-          <w:szCs w:val="18"/>
-          <w:lang w:val="en"/>
-        </w:rPr>
-        <w:t>Streamlit</w:t>
-      </w:r>
-      <w:proofErr w:type="spellEnd"/>
-      <w:r>
-        <w:rPr>
-          <w:rFonts w:ascii="Aptos" w:eastAsia="Times New Roman" w:hAnsi="Aptos"/>
-          <w:color w:val="53666F"/>
-          <w:sz w:val="18"/>
-          <w:szCs w:val="18"/>
-          <w:lang w:val="en"/>
-        </w:rPr>
-        <w:t xml:space="preserve"> English-to-Hindi translation interface with a submitted example and generated output</w:t>
+        <w:t>Figure 6. Final application capture: Streamlit English-to-Hindi translation interface with a submitted example and generated output</w:t>
       </w:r>
     </w:p>
     <w:p>
@@ -8315,7 +7977,7 @@
 </file>
 
 <file path=word/numbering.xml><?xml version="1.0" encoding="utf-8"?>
-<w:numbering xmlns:wpc="http://schemas.microsoft.com/office/word/2010/wordprocessingCanvas" xmlns:cx="http://schemas.microsoft.com/office/drawing/2014/chartex" xmlns:cx1="http://schemas.microsoft.com/office/drawing/2015/9/8/chartex" xmlns:cx2="http://schemas.microsoft.com/office/drawing/2015/10/21/chartex" xmlns:cx3="http://schemas.microsoft.com/office/drawing/2016/5/9/chartex" xmlns:cx4="http://schemas.microsoft.com/office/drawing/2016/5/10/chartex" xmlns:cx5="http://schemas.microsoft.com/office/drawing/2016/5/11/chartex" xmlns:cx6="http://schemas.microsoft.com/office/drawing/2016/5/12/chartex" xmlns:cx7="http://schemas.microsoft.com/office/drawing/2016/5/13/chartex" xmlns:cx8="http://schemas.microsoft.com/office/drawing/2016/5/14/chartex" xmlns:mc="http://schemas.openxmlformats.org/markup-compatibility/2006" xmlns:aink="http://schemas.microsoft.com/office/drawing/2016/ink" xmlns:am3d="http://schemas.microsoft.com/office/drawing/2017/model3d" xmlns:o="urn:schemas-microsoft-com:office:office" xmlns:oel="http://schemas.microsoft.com/office/2019/extlst" xmlns:r="http://schemas.openxmlformats.org/officeDocument/2006/relationships" xmlns:m="http://schemas.openxmlformats.org/officeDocument/2006/math" xmlns:v="urn:schemas-microsoft-com:vml" xmlns:wp14="http://schemas.microsoft.com/office/word/2010/wordprocessingDrawing" xmlns:wp="http://schemas.openxmlformats.org/drawingml/2006/wordprocessingDrawing" xmlns:w10="urn:schemas-microsoft-com:office:word" xmlns:w="http://schemas.openxmlformats.org/wordprocessingml/2006/main" xmlns:w14="http://schemas.microsoft.com/office/word/2010/wordml" xmlns:w15="http://schemas.microsoft.com/office/word/2012/wordml" xmlns:w16cei="http://schemas.microsoft.com/office/word/2026/wordml/cei" xmlns:w16cex="http://schemas.microsoft.com/office/word/2018/wordml/cex" xmlns:w16cid="http://schemas.microsoft.com/office/word/2016/wordml/cid" xmlns:w16="http://schemas.microsoft.com/office/word/2018/wordml" xmlns:w16du="http://schemas.microsoft.com/office/word/2023/wordml/word16du" xmlns:w16sdtdh="http://schemas.microsoft.com/office/word/2020/wordml/sdtdatahash" xmlns:w16sdtfl="http://schemas.microsoft.com/office/word/2024/wordml/sdtformatlock" xmlns:w16se="http://schemas.microsoft.com/office/word/2015/wordml/symex" xmlns:wpg="http://schemas.microsoft.com/office/word/2010/wordprocessingGroup" xmlns:wpi="http://schemas.microsoft.com/office/word/2010/wordprocessingInk" xmlns:wne="http://schemas.microsoft.com/office/word/2006/wordml" xmlns:wps="http://schemas.microsoft.com/office/word/2010/wordprocessingShape" mc:Ignorable="w14 w15 w16se w16cid w16 w16cex w16sdtdh w16sdtfl w16du wp14">
+<w:numbering xmlns:wpc="http://schemas.microsoft.com/office/word/2010/wordprocessingCanvas" xmlns:cx="http://schemas.microsoft.com/office/drawing/2014/chartex" xmlns:cx1="http://schemas.microsoft.com/office/drawing/2015/9/8/chartex" xmlns:cx2="http://schemas.microsoft.com/office/drawing/2015/10/21/chartex" xmlns:cx3="http://schemas.microsoft.com/office/drawing/2016/5/9/chartex" xmlns:cx4="http://schemas.microsoft.com/office/drawing/2016/5/10/chartex" xmlns:cx5="http://schemas.microsoft.com/office/drawing/2016/5/11/chartex" xmlns:cx6="http://schemas.microsoft.com/office/drawing/2016/5/12/chartex" xmlns:cx7="http://schemas.microsoft.com/office/drawing/2016/5/13/chartex" xmlns:cx8="http://schemas.microsoft.com/office/drawing/2016/5/14/chartex" xmlns:mc="http://schemas.openxmlformats.org/markup-compatibility/2006" xmlns:aink="http://schemas.microsoft.com/office/drawing/2016/ink" xmlns:am3d="http://schemas.microsoft.com/office/drawing/2017/model3d" xmlns:o="urn:schemas-microsoft-com:office:office" xmlns:oel="http://schemas.microsoft.com/office/2019/extlst" xmlns:r="http://schemas.openxmlformats.org/officeDocument/2006/relationships" xmlns:m="http://schemas.openxmlformats.org/officeDocument/2006/math" xmlns:v="urn:schemas-microsoft-com:vml" xmlns:wp14="http://schemas.microsoft.com/office/word/2010/wordprocessingDrawing" xmlns:wp="http://schemas.openxmlformats.org/drawingml/2006/wordprocessingDrawing" xmlns:w10="urn:schemas-microsoft-com:office:word" xmlns:w="http://schemas.openxmlformats.org/wordprocessingml/2006/main" xmlns:w14="http://schemas.microsoft.com/office/word/2010/wordml" xmlns:w15="http://schemas.microsoft.com/office/word/2012/wordml" xmlns:w16cex="http://schemas.microsoft.com/office/word/2018/wordml/cex" xmlns:w16cid="http://schemas.microsoft.com/office/word/2016/wordml/cid" xmlns:w16="http://schemas.microsoft.com/office/word/2018/wordml" xmlns:w16du="http://schemas.microsoft.com/office/word/2023/wordml/word16du" xmlns:w16sdtdh="http://schemas.microsoft.com/office/word/2020/wordml/sdtdatahash" xmlns:w16sdtfl="http://schemas.microsoft.com/office/word/2024/wordml/sdtformatlock" xmlns:w16se="http://schemas.microsoft.com/office/word/2015/wordml/symex" xmlns:wpg="http://schemas.microsoft.com/office/word/2010/wordprocessingGroup" xmlns:wpi="http://schemas.microsoft.com/office/word/2010/wordprocessingInk" xmlns:wne="http://schemas.microsoft.com/office/word/2006/wordml" xmlns:wps="http://schemas.microsoft.com/office/word/2010/wordprocessingShape" mc:Ignorable="w14 w15 w16se w16cid w16 w16cex w16sdtdh w16sdtfl w16du wp14">
   <w:abstractNum w:abstractNumId="0" w15:restartNumberingAfterBreak="0">
     <w:nsid w:val="76D81FE9"/>
     <w:multiLevelType w:val="hybridMultilevel"/>
@@ -9054,7 +8716,6 @@
   <w:style w:type="character" w:default="1" w:styleId="DefaultParagraphFont">
     <w:name w:val="Default Paragraph Font"/>
     <w:uiPriority w:val="1"/>
-    <w:semiHidden/>
     <w:unhideWhenUsed/>
   </w:style>
   <w:style w:type="table" w:default="1" w:styleId="TableNormal">

</xml_diff>

<commit_message>
Adding fixes and required sections in doc
</commit_message>
<xml_diff>
--- a/Group112 (1).docx
+++ b/Group112 (1).docx
@@ -2122,7 +2122,51 @@
           <w:szCs w:val="21"/>
           <w:lang w:val="en"/>
         </w:rPr>
-        <w:t>This project implements an English-to-Hindi neural machine translation system for digital-content localization and educational accessibility. The solution uses a sequence-to-sequence architecture with a bidirectional LSTM encoder, Bahdanau additive attention and an LSTM decoder. A Streamlit interface supports single-sentence translation, greedy or beam-search decoding, and batch translation from TXT or CSV input.</w:t>
+        <w:t xml:space="preserve">This project implements an English-to-Hindi neural machine translation system for digital-content localization and educational accessibility. The solution uses a sequence-to-sequence architecture with a bidirectional LSTM encoder, </w:t>
+      </w:r>
+      <w:proofErr w:type="spellStart"/>
+      <w:r>
+        <w:rPr>
+          <w:rFonts w:ascii="Aptos" w:hAnsi="Aptos"/>
+          <w:color w:val="1F2933"/>
+          <w:sz w:val="21"/>
+          <w:szCs w:val="21"/>
+          <w:lang w:val="en"/>
+        </w:rPr>
+        <w:t>Bahdanau</w:t>
+      </w:r>
+      <w:proofErr w:type="spellEnd"/>
+      <w:r>
+        <w:rPr>
+          <w:rFonts w:ascii="Aptos" w:hAnsi="Aptos"/>
+          <w:color w:val="1F2933"/>
+          <w:sz w:val="21"/>
+          <w:szCs w:val="21"/>
+          <w:lang w:val="en"/>
+        </w:rPr>
+        <w:t xml:space="preserve"> additive attention and an LSTM decoder. A </w:t>
+      </w:r>
+      <w:proofErr w:type="spellStart"/>
+      <w:r>
+        <w:rPr>
+          <w:rFonts w:ascii="Aptos" w:hAnsi="Aptos"/>
+          <w:color w:val="1F2933"/>
+          <w:sz w:val="21"/>
+          <w:szCs w:val="21"/>
+          <w:lang w:val="en"/>
+        </w:rPr>
+        <w:t>Streamlit</w:t>
+      </w:r>
+      <w:proofErr w:type="spellEnd"/>
+      <w:r>
+        <w:rPr>
+          <w:rFonts w:ascii="Aptos" w:hAnsi="Aptos"/>
+          <w:color w:val="1F2933"/>
+          <w:sz w:val="21"/>
+          <w:szCs w:val="21"/>
+          <w:lang w:val="en"/>
+        </w:rPr>
+        <w:t xml:space="preserve"> interface supports single-sentence translation, greedy or beam-search decoding, and batch translation from TXT or CSV input.</w:t>
       </w:r>
     </w:p>
     <w:p>
@@ -2176,7 +2220,29 @@
           <w:szCs w:val="21"/>
           <w:lang w:val="en"/>
         </w:rPr>
-        <w:t>, chrF 2</w:t>
+        <w:t xml:space="preserve">, </w:t>
+      </w:r>
+      <w:proofErr w:type="spellStart"/>
+      <w:r>
+        <w:rPr>
+          <w:rFonts w:ascii="Aptos" w:hAnsi="Aptos"/>
+          <w:color w:val="1F2933"/>
+          <w:sz w:val="21"/>
+          <w:szCs w:val="21"/>
+          <w:lang w:val="en"/>
+        </w:rPr>
+        <w:t>chrF</w:t>
+      </w:r>
+      <w:proofErr w:type="spellEnd"/>
+      <w:r>
+        <w:rPr>
+          <w:rFonts w:ascii="Aptos" w:hAnsi="Aptos"/>
+          <w:color w:val="1F2933"/>
+          <w:sz w:val="21"/>
+          <w:szCs w:val="21"/>
+          <w:lang w:val="en"/>
+        </w:rPr>
+        <w:t xml:space="preserve"> 2</w:t>
       </w:r>
       <w:r>
         <w:rPr>
@@ -3504,7 +3570,27 @@
                 <w:sz w:val="18"/>
                 <w:szCs w:val="18"/>
               </w:rPr>
-              <w:t>Encoder-decoder PyTorch model with bidirectional encoding and additive attention.</w:t>
+              <w:t xml:space="preserve">Encoder-decoder </w:t>
+            </w:r>
+            <w:proofErr w:type="spellStart"/>
+            <w:r>
+              <w:rPr>
+                <w:rFonts w:ascii="Aptos" w:eastAsia="Times New Roman" w:hAnsi="Aptos"/>
+                <w:color w:val="1F2933"/>
+                <w:sz w:val="18"/>
+                <w:szCs w:val="18"/>
+              </w:rPr>
+              <w:t>PyTorch</w:t>
+            </w:r>
+            <w:proofErr w:type="spellEnd"/>
+            <w:r>
+              <w:rPr>
+                <w:rFonts w:ascii="Aptos" w:eastAsia="Times New Roman" w:hAnsi="Aptos"/>
+                <w:color w:val="1F2933"/>
+                <w:sz w:val="18"/>
+                <w:szCs w:val="18"/>
+              </w:rPr>
+              <w:t xml:space="preserve"> model with bidirectional encoding and additive attention.</w:t>
             </w:r>
           </w:p>
         </w:tc>
@@ -3653,14 +3739,25 @@
                 <w:szCs w:val="18"/>
               </w:rPr>
             </w:pPr>
-            <w:r>
-              <w:rPr>
-                <w:rFonts w:ascii="Aptos" w:eastAsia="Times New Roman" w:hAnsi="Aptos"/>
-                <w:color w:val="1F2933"/>
-                <w:sz w:val="18"/>
-                <w:szCs w:val="18"/>
-              </w:rPr>
-              <w:t>Streamlit app with single-sentence and batch upload workflows.</w:t>
+            <w:proofErr w:type="spellStart"/>
+            <w:r>
+              <w:rPr>
+                <w:rFonts w:ascii="Aptos" w:eastAsia="Times New Roman" w:hAnsi="Aptos"/>
+                <w:color w:val="1F2933"/>
+                <w:sz w:val="18"/>
+                <w:szCs w:val="18"/>
+              </w:rPr>
+              <w:t>Streamlit</w:t>
+            </w:r>
+            <w:proofErr w:type="spellEnd"/>
+            <w:r>
+              <w:rPr>
+                <w:rFonts w:ascii="Aptos" w:eastAsia="Times New Roman" w:hAnsi="Aptos"/>
+                <w:color w:val="1F2933"/>
+                <w:sz w:val="18"/>
+                <w:szCs w:val="18"/>
+              </w:rPr>
+              <w:t xml:space="preserve"> app with single-sentence and batch upload workflows.</w:t>
             </w:r>
           </w:p>
         </w:tc>
@@ -3738,7 +3835,27 @@
                 <w:sz w:val="18"/>
                 <w:szCs w:val="18"/>
               </w:rPr>
-              <w:t>BLEU, chrF, ROUGE-L, METEOR and targeted failure analysis.</w:t>
+              <w:t xml:space="preserve">BLEU, </w:t>
+            </w:r>
+            <w:proofErr w:type="spellStart"/>
+            <w:r>
+              <w:rPr>
+                <w:rFonts w:ascii="Aptos" w:eastAsia="Times New Roman" w:hAnsi="Aptos"/>
+                <w:color w:val="1F2933"/>
+                <w:sz w:val="18"/>
+                <w:szCs w:val="18"/>
+              </w:rPr>
+              <w:t>chrF</w:t>
+            </w:r>
+            <w:proofErr w:type="spellEnd"/>
+            <w:r>
+              <w:rPr>
+                <w:rFonts w:ascii="Aptos" w:eastAsia="Times New Roman" w:hAnsi="Aptos"/>
+                <w:color w:val="1F2933"/>
+                <w:sz w:val="18"/>
+                <w:szCs w:val="18"/>
+              </w:rPr>
+              <w:t>, ROUGE-L, METEOR and targeted failure analysis.</w:t>
             </w:r>
           </w:p>
         </w:tc>
@@ -4472,6 +4589,7 @@
                 <w:szCs w:val="18"/>
               </w:rPr>
             </w:pPr>
+            <w:proofErr w:type="spellStart"/>
             <w:r>
               <w:rPr>
                 <w:rStyle w:val="code1"/>
@@ -4480,7 +4598,18 @@
                 <w:sz w:val="18"/>
                 <w:szCs w:val="18"/>
               </w:rPr>
-              <w:t>min_freq=4</w:t>
+              <w:t>min_freq</w:t>
+            </w:r>
+            <w:proofErr w:type="spellEnd"/>
+            <w:r>
+              <w:rPr>
+                <w:rStyle w:val="code1"/>
+                <w:rFonts w:eastAsia="Times New Roman"/>
+                <w:color w:val="1F2933"/>
+                <w:sz w:val="18"/>
+                <w:szCs w:val="18"/>
+              </w:rPr>
+              <w:t>=4</w:t>
             </w:r>
             <w:r>
               <w:rPr>
@@ -4580,7 +4709,29 @@
           <w:szCs w:val="21"/>
           <w:lang w:val="en"/>
         </w:rPr>
-        <w:t>&lt;sos&gt;</w:t>
+        <w:t>&lt;</w:t>
+      </w:r>
+      <w:proofErr w:type="spellStart"/>
+      <w:r>
+        <w:rPr>
+          <w:rStyle w:val="code1"/>
+          <w:color w:val="1F2933"/>
+          <w:sz w:val="21"/>
+          <w:szCs w:val="21"/>
+          <w:lang w:val="en"/>
+        </w:rPr>
+        <w:t>sos</w:t>
+      </w:r>
+      <w:proofErr w:type="spellEnd"/>
+      <w:r>
+        <w:rPr>
+          <w:rStyle w:val="code1"/>
+          <w:color w:val="1F2933"/>
+          <w:sz w:val="21"/>
+          <w:szCs w:val="21"/>
+          <w:lang w:val="en"/>
+        </w:rPr>
+        <w:t>&gt;</w:t>
       </w:r>
       <w:r>
         <w:rPr>
@@ -4600,7 +4751,29 @@
           <w:szCs w:val="21"/>
           <w:lang w:val="en"/>
         </w:rPr>
-        <w:t>&lt;eos&gt;</w:t>
+        <w:t>&lt;</w:t>
+      </w:r>
+      <w:proofErr w:type="spellStart"/>
+      <w:r>
+        <w:rPr>
+          <w:rStyle w:val="code1"/>
+          <w:color w:val="1F2933"/>
+          <w:sz w:val="21"/>
+          <w:szCs w:val="21"/>
+          <w:lang w:val="en"/>
+        </w:rPr>
+        <w:t>eos</w:t>
+      </w:r>
+      <w:proofErr w:type="spellEnd"/>
+      <w:r>
+        <w:rPr>
+          <w:rStyle w:val="code1"/>
+          <w:color w:val="1F2933"/>
+          <w:sz w:val="21"/>
+          <w:szCs w:val="21"/>
+          <w:lang w:val="en"/>
+        </w:rPr>
+        <w:t>&gt;</w:t>
       </w:r>
       <w:r>
         <w:rPr>
@@ -4648,7 +4821,73 @@
           <w:szCs w:val="21"/>
           <w:lang w:val="en"/>
         </w:rPr>
-        <w:t>Raw corpus → cleaned sentence pairs → 80/10/10 split → training-only vocabularies → integer ID matrices → PyTorch DataLoaders → trained checkpoint → CLI and Streamlit inference.</w:t>
+        <w:t xml:space="preserve">Raw corpus → cleaned sentence pairs → 80/10/10 split → training-only vocabularies → integer ID matrices → </w:t>
+      </w:r>
+      <w:proofErr w:type="spellStart"/>
+      <w:r>
+        <w:rPr>
+          <w:rFonts w:ascii="Aptos" w:hAnsi="Aptos"/>
+          <w:color w:val="1F2933"/>
+          <w:sz w:val="21"/>
+          <w:szCs w:val="21"/>
+          <w:lang w:val="en"/>
+        </w:rPr>
+        <w:t>PyTorch</w:t>
+      </w:r>
+      <w:proofErr w:type="spellEnd"/>
+      <w:r>
+        <w:rPr>
+          <w:rFonts w:ascii="Aptos" w:hAnsi="Aptos"/>
+          <w:color w:val="1F2933"/>
+          <w:sz w:val="21"/>
+          <w:szCs w:val="21"/>
+          <w:lang w:val="en"/>
+        </w:rPr>
+        <w:t xml:space="preserve"> </w:t>
+      </w:r>
+      <w:proofErr w:type="spellStart"/>
+      <w:r>
+        <w:rPr>
+          <w:rFonts w:ascii="Aptos" w:hAnsi="Aptos"/>
+          <w:color w:val="1F2933"/>
+          <w:sz w:val="21"/>
+          <w:szCs w:val="21"/>
+          <w:lang w:val="en"/>
+        </w:rPr>
+        <w:t>DataLoaders</w:t>
+      </w:r>
+      <w:proofErr w:type="spellEnd"/>
+      <w:r>
+        <w:rPr>
+          <w:rFonts w:ascii="Aptos" w:hAnsi="Aptos"/>
+          <w:color w:val="1F2933"/>
+          <w:sz w:val="21"/>
+          <w:szCs w:val="21"/>
+          <w:lang w:val="en"/>
+        </w:rPr>
+        <w:t xml:space="preserve"> → trained checkpoint → CLI and </w:t>
+      </w:r>
+      <w:proofErr w:type="spellStart"/>
+      <w:r>
+        <w:rPr>
+          <w:rFonts w:ascii="Aptos" w:hAnsi="Aptos"/>
+          <w:color w:val="1F2933"/>
+          <w:sz w:val="21"/>
+          <w:szCs w:val="21"/>
+          <w:lang w:val="en"/>
+        </w:rPr>
+        <w:t>Streamlit</w:t>
+      </w:r>
+      <w:proofErr w:type="spellEnd"/>
+      <w:r>
+        <w:rPr>
+          <w:rFonts w:ascii="Aptos" w:hAnsi="Aptos"/>
+          <w:color w:val="1F2933"/>
+          <w:sz w:val="21"/>
+          <w:szCs w:val="21"/>
+          <w:lang w:val="en"/>
+        </w:rPr>
+        <w:t xml:space="preserve"> inference.</w:t>
       </w:r>
       <w:r>
         <w:rPr>
@@ -4796,9 +5035,9 @@
         <w:tblLook w:val="04A0" w:firstRow="1" w:lastRow="0" w:firstColumn="1" w:lastColumn="0" w:noHBand="0" w:noVBand="1"/>
       </w:tblPr>
       <w:tblGrid>
-        <w:gridCol w:w="1542"/>
-        <w:gridCol w:w="3738"/>
-        <w:gridCol w:w="4796"/>
+        <w:gridCol w:w="1527"/>
+        <w:gridCol w:w="3701"/>
+        <w:gridCol w:w="4848"/>
       </w:tblGrid>
       <w:tr>
         <w:tc>
@@ -4990,7 +5229,29 @@
                 <w:sz w:val="18"/>
                 <w:szCs w:val="18"/>
               </w:rPr>
-              <w:t>python run_pipeline.py --min_freq 4</w:t>
+              <w:t>python run_pipeline.py --</w:t>
+            </w:r>
+            <w:proofErr w:type="spellStart"/>
+            <w:r>
+              <w:rPr>
+                <w:rStyle w:val="code1"/>
+                <w:rFonts w:eastAsia="Times New Roman"/>
+                <w:color w:val="1F2933"/>
+                <w:sz w:val="18"/>
+                <w:szCs w:val="18"/>
+              </w:rPr>
+              <w:t>min_freq</w:t>
+            </w:r>
+            <w:proofErr w:type="spellEnd"/>
+            <w:r>
+              <w:rPr>
+                <w:rStyle w:val="code1"/>
+                <w:rFonts w:eastAsia="Times New Roman"/>
+                <w:color w:val="1F2933"/>
+                <w:sz w:val="18"/>
+                <w:szCs w:val="18"/>
+              </w:rPr>
+              <w:t xml:space="preserve"> 4</w:t>
             </w:r>
           </w:p>
         </w:tc>
@@ -5165,7 +5426,27 @@
                 <w:sz w:val="18"/>
                 <w:szCs w:val="18"/>
               </w:rPr>
-              <w:t>media/</w:t>
+              <w:t>m</w:t>
+            </w:r>
+            <w:r>
+              <w:rPr>
+                <w:rStyle w:val="code1"/>
+                <w:rFonts w:eastAsia="Times New Roman"/>
+                <w:color w:val="1F2933"/>
+                <w:sz w:val="18"/>
+                <w:szCs w:val="18"/>
+              </w:rPr>
+              <w:t>odels</w:t>
+            </w:r>
+            <w:r>
+              <w:rPr>
+                <w:rStyle w:val="code1"/>
+                <w:rFonts w:eastAsia="Times New Roman"/>
+                <w:color w:val="1F2933"/>
+                <w:sz w:val="18"/>
+                <w:szCs w:val="18"/>
+              </w:rPr>
+              <w:t>/</w:t>
             </w:r>
           </w:p>
         </w:tc>
@@ -5244,7 +5525,29 @@
                 <w:sz w:val="18"/>
                 <w:szCs w:val="18"/>
               </w:rPr>
-              <w:t>python evaluate.py --n_samples 500</w:t>
+              <w:t>python evaluate.py --</w:t>
+            </w:r>
+            <w:proofErr w:type="spellStart"/>
+            <w:r>
+              <w:rPr>
+                <w:rStyle w:val="code1"/>
+                <w:rFonts w:eastAsia="Times New Roman"/>
+                <w:color w:val="1F2933"/>
+                <w:sz w:val="18"/>
+                <w:szCs w:val="18"/>
+              </w:rPr>
+              <w:t>n_samples</w:t>
+            </w:r>
+            <w:proofErr w:type="spellEnd"/>
+            <w:r>
+              <w:rPr>
+                <w:rStyle w:val="code1"/>
+                <w:rFonts w:eastAsia="Times New Roman"/>
+                <w:color w:val="1F2933"/>
+                <w:sz w:val="18"/>
+                <w:szCs w:val="18"/>
+              </w:rPr>
+              <w:t xml:space="preserve"> 500</w:t>
             </w:r>
           </w:p>
         </w:tc>
@@ -5292,8 +5595,40 @@
                 <w:sz w:val="18"/>
                 <w:szCs w:val="18"/>
               </w:rPr>
-              <w:t>media/eval_report.json</w:t>
-            </w:r>
+              <w:t>m</w:t>
+            </w:r>
+            <w:r>
+              <w:rPr>
+                <w:rStyle w:val="code1"/>
+                <w:rFonts w:eastAsia="Times New Roman"/>
+                <w:color w:val="1F2933"/>
+                <w:sz w:val="18"/>
+                <w:szCs w:val="18"/>
+              </w:rPr>
+              <w:t>odels</w:t>
+            </w:r>
+            <w:r>
+              <w:rPr>
+                <w:rStyle w:val="code1"/>
+                <w:rFonts w:eastAsia="Times New Roman"/>
+                <w:color w:val="1F2933"/>
+                <w:sz w:val="18"/>
+                <w:szCs w:val="18"/>
+              </w:rPr>
+              <w:t>/</w:t>
+            </w:r>
+            <w:proofErr w:type="spellStart"/>
+            <w:r>
+              <w:rPr>
+                <w:rStyle w:val="code1"/>
+                <w:rFonts w:eastAsia="Times New Roman"/>
+                <w:color w:val="1F2933"/>
+                <w:sz w:val="18"/>
+                <w:szCs w:val="18"/>
+              </w:rPr>
+              <w:t>eval_report.json</w:t>
+            </w:r>
+            <w:proofErr w:type="spellEnd"/>
           </w:p>
         </w:tc>
       </w:tr>
@@ -5480,6 +5815,7 @@
                 <w:szCs w:val="18"/>
               </w:rPr>
             </w:pPr>
+            <w:proofErr w:type="spellStart"/>
             <w:r>
               <w:rPr>
                 <w:rStyle w:val="code1"/>
@@ -5488,7 +5824,18 @@
                 <w:sz w:val="18"/>
                 <w:szCs w:val="18"/>
               </w:rPr>
-              <w:t>streamlit run app.py</w:t>
+              <w:t>streamlit</w:t>
+            </w:r>
+            <w:proofErr w:type="spellEnd"/>
+            <w:r>
+              <w:rPr>
+                <w:rStyle w:val="code1"/>
+                <w:rFonts w:eastAsia="Times New Roman"/>
+                <w:color w:val="1F2933"/>
+                <w:sz w:val="18"/>
+                <w:szCs w:val="18"/>
+              </w:rPr>
+              <w:t xml:space="preserve"> run app.py</w:t>
             </w:r>
           </w:p>
         </w:tc>
@@ -5638,7 +5985,29 @@
           <w:szCs w:val="21"/>
           <w:lang w:val="en"/>
         </w:rPr>
-        <w:t>At each decoding step, Bahdanau additive attention scores every encoder output against the current decoder hidden state. The resulting context vector is concatenated with the current target embedding and passed to an LSTM. The decoder output, attention context and embedding are combined by a linear projection into the Hindi vocabulary distribution.</w:t>
+        <w:t xml:space="preserve">At each decoding step, </w:t>
+      </w:r>
+      <w:proofErr w:type="spellStart"/>
+      <w:r>
+        <w:rPr>
+          <w:rFonts w:ascii="Aptos" w:hAnsi="Aptos"/>
+          <w:color w:val="1F2933"/>
+          <w:sz w:val="21"/>
+          <w:szCs w:val="21"/>
+          <w:lang w:val="en"/>
+        </w:rPr>
+        <w:t>Bahdanau</w:t>
+      </w:r>
+      <w:proofErr w:type="spellEnd"/>
+      <w:r>
+        <w:rPr>
+          <w:rFonts w:ascii="Aptos" w:hAnsi="Aptos"/>
+          <w:color w:val="1F2933"/>
+          <w:sz w:val="21"/>
+          <w:szCs w:val="21"/>
+          <w:lang w:val="en"/>
+        </w:rPr>
+        <w:t xml:space="preserve"> additive attention scores every encoder output against the current decoder hidden state. The resulting context vector is concatenated with the current target embedding and passed to an LSTM. The decoder output, attention context and embedding are combined by a linear projection into the Hindi vocabulary distribution.</w:t>
       </w:r>
     </w:p>
     <w:p>
@@ -6335,10 +6704,10 @@
           <w:lang w:val="en"/>
         </w:rPr>
         <w:drawing>
-          <wp:inline distT="0" distB="0" distL="0" distR="0" wp14:anchorId="723984EC" wp14:editId="5CBB1FB7">
-            <wp:extent cx="6264910" cy="3793490"/>
+          <wp:inline distT="0" distB="0" distL="0" distR="0" wp14:anchorId="2034A0AB" wp14:editId="2189150D">
+            <wp:extent cx="6264910" cy="3524250"/>
             <wp:effectExtent l="0" t="0" r="0" b="0"/>
-            <wp:docPr id="1813932468" name="Picture 1"/>
+            <wp:docPr id="1068217415" name="Picture 3"/>
             <wp:cNvGraphicFramePr>
               <a:graphicFrameLocks xmlns:a="http://schemas.openxmlformats.org/drawingml/2006/main" noChangeAspect="1"/>
             </wp:cNvGraphicFramePr>
@@ -6346,11 +6715,17 @@
               <a:graphicData uri="http://schemas.openxmlformats.org/drawingml/2006/picture">
                 <pic:pic xmlns:pic="http://schemas.openxmlformats.org/drawingml/2006/picture">
                   <pic:nvPicPr>
-                    <pic:cNvPr id="1813932468" name=""/>
+                    <pic:cNvPr id="1068217415" name="Picture 1068217415"/>
                     <pic:cNvPicPr/>
                   </pic:nvPicPr>
                   <pic:blipFill>
-                    <a:blip r:embed="rId8"/>
+                    <a:blip r:embed="rId8" cstate="print">
+                      <a:extLst>
+                        <a:ext uri="{28A0092B-C50C-407E-A947-70E740481C1C}">
+                          <a14:useLocalDpi xmlns:a14="http://schemas.microsoft.com/office/drawing/2010/main" val="0"/>
+                        </a:ext>
+                      </a:extLst>
+                    </a:blip>
                     <a:stretch>
                       <a:fillRect/>
                     </a:stretch>
@@ -6358,7 +6733,7 @@
                   <pic:spPr>
                     <a:xfrm>
                       <a:off x="0" y="0"/>
-                      <a:ext cx="6264910" cy="3793490"/>
+                      <a:ext cx="6264910" cy="3524250"/>
                     </a:xfrm>
                     <a:prstGeom prst="rect">
                       <a:avLst/>
@@ -6436,6 +6811,15 @@
           <w:lang w:val="en"/>
         </w:rPr>
       </w:pPr>
+      <w:r>
+        <w:rPr>
+          <w:rFonts w:ascii="Aptos" w:eastAsia="Times New Roman" w:hAnsi="Aptos"/>
+          <w:color w:val="53666F"/>
+          <w:sz w:val="18"/>
+          <w:szCs w:val="18"/>
+        </w:rPr>
+        <w:t>Note: The attached training screenshot reflects an earlier work-in-progress run. The model was subsequently retrained and further enhanced.</w:t>
+      </w:r>
       <w:r>
         <w:rPr>
           <w:noProof/>
@@ -6510,6 +6894,7 @@
           <w:szCs w:val="18"/>
           <w:lang w:val="en"/>
         </w:rPr>
+        <w:lastRenderedPageBreak/>
         <w:t>F</w:t>
       </w:r>
       <w:r>
@@ -6552,7 +6937,31 @@
           <w:szCs w:val="21"/>
           <w:lang w:val="en"/>
         </w:rPr>
-        <w:t>Model training and inference execution in the BITS Virtual Lab : The screenshots show the successful execution of the NMT model in the BITS Virtual Lab, including model training, checkpoint saving, and sample English-to-Hindi translations.</w:t>
+        <w:t xml:space="preserve">Model training and inference execution in the BITS Virtual </w:t>
+      </w:r>
+      <w:proofErr w:type="gramStart"/>
+      <w:r>
+        <w:rPr>
+          <w:rFonts w:ascii="Aptos" w:hAnsi="Aptos" w:cs="Times New Roman"/>
+          <w:color w:val="1F2933"/>
+          <w:kern w:val="0"/>
+          <w:sz w:val="21"/>
+          <w:szCs w:val="21"/>
+          <w:lang w:val="en"/>
+        </w:rPr>
+        <w:t>Lab :</w:t>
+      </w:r>
+      <w:proofErr w:type="gramEnd"/>
+      <w:r>
+        <w:rPr>
+          <w:rFonts w:ascii="Aptos" w:hAnsi="Aptos" w:cs="Times New Roman"/>
+          <w:color w:val="1F2933"/>
+          <w:kern w:val="0"/>
+          <w:sz w:val="21"/>
+          <w:szCs w:val="21"/>
+          <w:lang w:val="en"/>
+        </w:rPr>
+        <w:t xml:space="preserve"> The screenshots show the successful execution of the NMT model in the BITS Virtual Lab, including model training, checkpoint saving, and sample English-to-Hindi translations.</w:t>
       </w:r>
       <w:r>
         <w:rPr>
@@ -6812,7 +7221,29 @@
           <w:szCs w:val="18"/>
           <w:lang w:val="en"/>
         </w:rPr>
-        <w:t xml:space="preserve">Figure 3. Single-sentence input screen with the sample how are you, </w:t>
+        <w:t xml:space="preserve">Figure 3. Single-sentence input screen with the sample how </w:t>
+      </w:r>
+      <w:proofErr w:type="gramStart"/>
+      <w:r>
+        <w:rPr>
+          <w:rFonts w:ascii="Aptos" w:eastAsia="Times New Roman" w:hAnsi="Aptos"/>
+          <w:color w:val="53666F"/>
+          <w:sz w:val="18"/>
+          <w:szCs w:val="18"/>
+          <w:lang w:val="en"/>
+        </w:rPr>
+        <w:t>are</w:t>
+      </w:r>
+      <w:proofErr w:type="gramEnd"/>
+      <w:r>
+        <w:rPr>
+          <w:rFonts w:ascii="Aptos" w:eastAsia="Times New Roman" w:hAnsi="Aptos"/>
+          <w:color w:val="53666F"/>
+          <w:sz w:val="18"/>
+          <w:szCs w:val="18"/>
+          <w:lang w:val="en"/>
+        </w:rPr>
+        <w:t xml:space="preserve"> you, </w:t>
       </w:r>
       <w:r>
         <w:rPr>
@@ -7302,7 +7733,29 @@
           <w:szCs w:val="21"/>
           <w:lang w:val="en"/>
         </w:rPr>
-        <w:t>3. Short and medium inputs have similar chrF performance, while long inputs are slightly weaker. This is consistent with the sequential model needing to preserve more context over longer and more complex sentences.</w:t>
+        <w:t xml:space="preserve">3. Short and medium inputs have similar </w:t>
+      </w:r>
+      <w:proofErr w:type="spellStart"/>
+      <w:r>
+        <w:rPr>
+          <w:rFonts w:ascii="Aptos" w:hAnsi="Aptos"/>
+          <w:color w:val="1F2933"/>
+          <w:sz w:val="21"/>
+          <w:szCs w:val="21"/>
+          <w:lang w:val="en"/>
+        </w:rPr>
+        <w:t>chrF</w:t>
+      </w:r>
+      <w:proofErr w:type="spellEnd"/>
+      <w:r>
+        <w:rPr>
+          <w:rFonts w:ascii="Aptos" w:hAnsi="Aptos"/>
+          <w:color w:val="1F2933"/>
+          <w:sz w:val="21"/>
+          <w:szCs w:val="21"/>
+          <w:lang w:val="en"/>
+        </w:rPr>
+        <w:t xml:space="preserve"> performance, while long inputs are slightly weaker. This is consistent with the sequential model needing to preserve more context over longer and more complex sentences.</w:t>
       </w:r>
     </w:p>
     <w:p>
@@ -7397,7 +7850,27 @@
           <w:sz w:val="21"/>
           <w:szCs w:val="21"/>
         </w:rPr>
-        <w:t>English follows a subject-verb-object structure, while Hindi follows a subject-object-verb structure. Correct translation therefore requires reordering sentence constituents rather than mapping words one to one in the original sequence. Several outputs in this evaluation show this failure mode. In the example "the government has announced a new policy for farmers," the generated output repeats the subject "sarkar" (government) at multiple positions instead of placing the verb and object in a single, correctly ordered Hindi clause. This is a distinct issue from vocabulary coverage, since the model here uses known, in-vocabulary words but fails to arrange them in a grammatically valid sequence. It reflects the limited capacity of the BiLSTM encoder-decoder to learn long-range structural reordering from a training set of this size, and it becomes more pronounced in longer sentences with multiple clauses.</w:t>
+        <w:t xml:space="preserve">English follows a subject-verb-object structure, while Hindi follows a subject-object-verb structure. Correct translation therefore requires reordering sentence constituents rather than mapping words one to one in the original sequence. Several outputs in this evaluation show this failure mode. In the example "the government has announced a new policy for farmers," the generated output repeats the subject "sarkar" (government) at multiple positions instead of placing the verb and object in a single, correctly ordered Hindi clause. This is a distinct issue from vocabulary coverage, since the model here uses known, in-vocabulary words but fails to arrange them in a grammatically valid sequence. It reflects the limited capacity of the </w:t>
+      </w:r>
+      <w:proofErr w:type="spellStart"/>
+      <w:r>
+        <w:rPr>
+          <w:rFonts w:ascii="Aptos" w:hAnsi="Aptos"/>
+          <w:color w:val="1F2933"/>
+          <w:sz w:val="21"/>
+          <w:szCs w:val="21"/>
+        </w:rPr>
+        <w:t>BiLSTM</w:t>
+      </w:r>
+      <w:proofErr w:type="spellEnd"/>
+      <w:r>
+        <w:rPr>
+          <w:rFonts w:ascii="Aptos" w:hAnsi="Aptos"/>
+          <w:color w:val="1F2933"/>
+          <w:sz w:val="21"/>
+          <w:szCs w:val="21"/>
+        </w:rPr>
+        <w:t xml:space="preserve"> encoder-decoder to learn long-range structural reordering from a training set of this size, and it becomes more pronounced in longer sentences with multiple clauses.</w:t>
       </w:r>
     </w:p>
     <w:p>
@@ -7447,7 +7920,29 @@
           <w:szCs w:val="21"/>
           <w:lang w:val="en"/>
         </w:rPr>
-        <w:t>An end-to-end English-to-Hindi NMT system was implemented, evaluated and integrated into a usable Streamlit application. The repository now clearly separates preparation, training, evaluation, inference, application code and generated artifacts. The submitted model produces valid Hindi output for some common inputs and supports useful operational workflows such as beam decoding and batch CSV export.</w:t>
+        <w:t xml:space="preserve">An end-to-end English-to-Hindi NMT system was implemented, evaluated and integrated into a usable </w:t>
+      </w:r>
+      <w:proofErr w:type="spellStart"/>
+      <w:r>
+        <w:rPr>
+          <w:rFonts w:ascii="Aptos" w:hAnsi="Aptos"/>
+          <w:color w:val="1F2933"/>
+          <w:sz w:val="21"/>
+          <w:szCs w:val="21"/>
+          <w:lang w:val="en"/>
+        </w:rPr>
+        <w:t>Streamlit</w:t>
+      </w:r>
+      <w:proofErr w:type="spellEnd"/>
+      <w:r>
+        <w:rPr>
+          <w:rFonts w:ascii="Aptos" w:hAnsi="Aptos"/>
+          <w:color w:val="1F2933"/>
+          <w:sz w:val="21"/>
+          <w:szCs w:val="21"/>
+          <w:lang w:val="en"/>
+        </w:rPr>
+        <w:t xml:space="preserve"> application. The repository now clearly separates preparation, training, evaluation, inference, application code and generated artifacts. The submitted model produces valid Hindi output for some common inputs and supports useful operational workflows such as beam decoding and batch CSV export.</w:t>
       </w:r>
     </w:p>
     <w:p>
@@ -7469,7 +7964,29 @@
           <w:szCs w:val="21"/>
           <w:lang w:val="en"/>
         </w:rPr>
-        <w:t>The measured scores and failure analysis show that the project meets the implementation objective while also making its quality boundaries explicit. The strongest next step is subword-based modeling with broader data, which should directly address the observed 88.</w:t>
+        <w:t xml:space="preserve">The measured scores and failure analysis show that the project meets the implementation objective while also making its quality boundaries explicit. The strongest next step is </w:t>
+      </w:r>
+      <w:proofErr w:type="spellStart"/>
+      <w:r>
+        <w:rPr>
+          <w:rFonts w:ascii="Aptos" w:hAnsi="Aptos"/>
+          <w:color w:val="1F2933"/>
+          <w:sz w:val="21"/>
+          <w:szCs w:val="21"/>
+          <w:lang w:val="en"/>
+        </w:rPr>
+        <w:t>subword</w:t>
+      </w:r>
+      <w:proofErr w:type="spellEnd"/>
+      <w:r>
+        <w:rPr>
+          <w:rFonts w:ascii="Aptos" w:hAnsi="Aptos"/>
+          <w:color w:val="1F2933"/>
+          <w:sz w:val="21"/>
+          <w:szCs w:val="21"/>
+          <w:lang w:val="en"/>
+        </w:rPr>
+        <w:t>-based modeling with broader data, which should directly address the observed 88.</w:t>
       </w:r>
       <w:r>
         <w:rPr>
@@ -7595,7 +8112,40 @@
           <w:szCs w:val="21"/>
           <w:lang w:val="en"/>
         </w:rPr>
-        <w:t xml:space="preserve">[2] Bahdanau, D., Cho, K. and Bengio, Y., Neural Machine Translation by Jointly Learning to Align and </w:t>
+        <w:t xml:space="preserve">[2] </w:t>
+      </w:r>
+      <w:proofErr w:type="spellStart"/>
+      <w:r>
+        <w:rPr>
+          <w:rFonts w:ascii="Aptos" w:hAnsi="Aptos"/>
+          <w:color w:val="1F2933"/>
+          <w:sz w:val="21"/>
+          <w:szCs w:val="21"/>
+          <w:lang w:val="en"/>
+        </w:rPr>
+        <w:t>Bahdanau</w:t>
+      </w:r>
+      <w:proofErr w:type="spellEnd"/>
+      <w:r>
+        <w:rPr>
+          <w:rFonts w:ascii="Aptos" w:hAnsi="Aptos"/>
+          <w:color w:val="1F2933"/>
+          <w:sz w:val="21"/>
+          <w:szCs w:val="21"/>
+          <w:lang w:val="en"/>
+        </w:rPr>
+        <w:t xml:space="preserve">, D., Cho, K. and Bengio, Y., Neural Machine Translation by Jointly Learning to Align </w:t>
+      </w:r>
+      <w:proofErr w:type="gramStart"/>
+      <w:r>
+        <w:rPr>
+          <w:rFonts w:ascii="Aptos" w:hAnsi="Aptos"/>
+          <w:color w:val="1F2933"/>
+          <w:sz w:val="21"/>
+          <w:szCs w:val="21"/>
+          <w:lang w:val="en"/>
+        </w:rPr>
+        <w:t xml:space="preserve">and </w:t>
       </w:r>
       <w:r>
         <w:rPr>
@@ -7615,7 +8165,18 @@
           <w:szCs w:val="21"/>
           <w:lang w:val="en"/>
         </w:rPr>
-        <w:t>Translate, ICLR, 2015.</w:t>
+        <w:t>Translate</w:t>
+      </w:r>
+      <w:proofErr w:type="gramEnd"/>
+      <w:r>
+        <w:rPr>
+          <w:rFonts w:ascii="Aptos" w:hAnsi="Aptos"/>
+          <w:color w:val="1F2933"/>
+          <w:sz w:val="21"/>
+          <w:szCs w:val="21"/>
+          <w:lang w:val="en"/>
+        </w:rPr>
+        <w:t>, ICLR, 2015.</w:t>
       </w:r>
     </w:p>
     <w:p>
@@ -7649,7 +8210,29 @@
           <w:szCs w:val="21"/>
           <w:lang w:val="en"/>
         </w:rPr>
-        <w:t>[3] PyTorch Documentation, Sequence Models and Recurrent Neural Networks, https://pytorch.org/docs/</w:t>
+        <w:t xml:space="preserve">[3] </w:t>
+      </w:r>
+      <w:proofErr w:type="spellStart"/>
+      <w:r>
+        <w:rPr>
+          <w:rFonts w:ascii="Aptos" w:hAnsi="Aptos"/>
+          <w:color w:val="1F2933"/>
+          <w:sz w:val="21"/>
+          <w:szCs w:val="21"/>
+          <w:lang w:val="en"/>
+        </w:rPr>
+        <w:t>PyTorch</w:t>
+      </w:r>
+      <w:proofErr w:type="spellEnd"/>
+      <w:r>
+        <w:rPr>
+          <w:rFonts w:ascii="Aptos" w:hAnsi="Aptos"/>
+          <w:color w:val="1F2933"/>
+          <w:sz w:val="21"/>
+          <w:szCs w:val="21"/>
+          <w:lang w:val="en"/>
+        </w:rPr>
+        <w:t xml:space="preserve"> Documentation, Sequence Models and Recurrent Neural Networks, https://pytorch.org/docs/</w:t>
       </w:r>
     </w:p>
     <w:p>
@@ -7682,7 +8265,29 @@
           <w:szCs w:val="21"/>
           <w:lang w:val="en"/>
         </w:rPr>
-        <w:t>[4] Streamlit Documentation, Build and deploy data apps, https://docs.streamlit.io/</w:t>
+        <w:t xml:space="preserve">[4] </w:t>
+      </w:r>
+      <w:proofErr w:type="spellStart"/>
+      <w:r>
+        <w:rPr>
+          <w:rFonts w:ascii="Aptos" w:hAnsi="Aptos"/>
+          <w:color w:val="1F2933"/>
+          <w:sz w:val="21"/>
+          <w:szCs w:val="21"/>
+          <w:lang w:val="en"/>
+        </w:rPr>
+        <w:t>Streamlit</w:t>
+      </w:r>
+      <w:proofErr w:type="spellEnd"/>
+      <w:r>
+        <w:rPr>
+          <w:rFonts w:ascii="Aptos" w:hAnsi="Aptos"/>
+          <w:color w:val="1F2933"/>
+          <w:sz w:val="21"/>
+          <w:szCs w:val="21"/>
+          <w:lang w:val="en"/>
+        </w:rPr>
+        <w:t xml:space="preserve"> Documentation, Build and deploy data apps, https://docs.streamlit.io/</w:t>
       </w:r>
     </w:p>
     <w:p>
@@ -7933,7 +8538,29 @@
           <w:szCs w:val="18"/>
           <w:lang w:val="en"/>
         </w:rPr>
-        <w:t>Figure 6. Final application capture: Streamlit English-to-Hindi translation interface with a submitted example and generated output</w:t>
+        <w:t xml:space="preserve">Figure 6. Final application capture: </w:t>
+      </w:r>
+      <w:proofErr w:type="spellStart"/>
+      <w:r>
+        <w:rPr>
+          <w:rFonts w:ascii="Aptos" w:eastAsia="Times New Roman" w:hAnsi="Aptos"/>
+          <w:color w:val="53666F"/>
+          <w:sz w:val="18"/>
+          <w:szCs w:val="18"/>
+          <w:lang w:val="en"/>
+        </w:rPr>
+        <w:t>Streamlit</w:t>
+      </w:r>
+      <w:proofErr w:type="spellEnd"/>
+      <w:r>
+        <w:rPr>
+          <w:rFonts w:ascii="Aptos" w:eastAsia="Times New Roman" w:hAnsi="Aptos"/>
+          <w:color w:val="53666F"/>
+          <w:sz w:val="18"/>
+          <w:szCs w:val="18"/>
+          <w:lang w:val="en"/>
+        </w:rPr>
+        <w:t xml:space="preserve"> English-to-Hindi translation interface with a submitted example and generated output</w:t>
       </w:r>
     </w:p>
     <w:p>

</xml_diff>